<commit_message>
added categories for part of speech
</commit_message>
<xml_diff>
--- a/Projektdokumentation.docx
+++ b/Projektdokumentation.docx
@@ -3,23 +3,1736 @@
 <w:document xmlns:wpc="http://schemas.microsoft.com/office/word/2010/wordprocessingCanvas" xmlns:cx="http://schemas.microsoft.com/office/drawing/2014/chartex" xmlns:cx1="http://schemas.microsoft.com/office/drawing/2015/9/8/chartex" xmlns:cx2="http://schemas.microsoft.com/office/drawing/2015/10/21/chartex" xmlns:cx3="http://schemas.microsoft.com/office/drawing/2016/5/9/chartex" xmlns:cx4="http://schemas.microsoft.com/office/drawing/2016/5/10/chartex" xmlns:cx5="http://schemas.microsoft.com/office/drawing/2016/5/11/chartex" xmlns:cx6="http://schemas.microsoft.com/office/drawing/2016/5/12/chartex" xmlns:cx7="http://schemas.microsoft.com/office/drawing/2016/5/13/chartex" xmlns:cx8="http://schemas.microsoft.com/office/drawing/2016/5/14/chartex" xmlns:mc="http://schemas.openxmlformats.org/markup-compatibility/2006" xmlns:aink="http://schemas.microsoft.com/office/drawing/2016/ink" xmlns:am3d="http://schemas.microsoft.com/office/drawing/2017/model3d" xmlns:o="urn:schemas-microsoft-com:office:office" xmlns:oel="http://schemas.microsoft.com/office/2019/extlst" xmlns:r="http://schemas.openxmlformats.org/officeDocument/2006/relationships" xmlns:m="http://schemas.openxmlformats.org/officeDocument/2006/math" xmlns:v="urn:schemas-microsoft-com:vml" xmlns:wp14="http://schemas.microsoft.com/office/word/2010/wordprocessingDrawing" xmlns:wp="http://schemas.openxmlformats.org/drawingml/2006/wordprocessingDrawing" xmlns:w10="urn:schemas-microsoft-com:office:word" xmlns:w="http://schemas.openxmlformats.org/wordprocessingml/2006/main" xmlns:w14="http://schemas.microsoft.com/office/word/2010/wordml" xmlns:w15="http://schemas.microsoft.com/office/word/2012/wordml" xmlns:w16cex="http://schemas.microsoft.com/office/word/2018/wordml/cex" xmlns:w16cid="http://schemas.microsoft.com/office/word/2016/wordml/cid" xmlns:w16="http://schemas.microsoft.com/office/word/2018/wordml" xmlns:w16du="http://schemas.microsoft.com/office/word/2023/wordml/word16du" xmlns:w16sdtdh="http://schemas.microsoft.com/office/word/2020/wordml/sdtdatahash" xmlns:w16sdtfl="http://schemas.microsoft.com/office/word/2024/wordml/sdtformatlock" xmlns:w16se="http://schemas.microsoft.com/office/word/2015/wordml/symex" xmlns:wpg="http://schemas.microsoft.com/office/word/2010/wordprocessingGroup" xmlns:wpi="http://schemas.microsoft.com/office/word/2010/wordprocessingInk" xmlns:wne="http://schemas.microsoft.com/office/word/2006/wordml" xmlns:wps="http://schemas.microsoft.com/office/word/2010/wordprocessingShape" mc:Ignorable="w14 w15 w16se w16cid w16 w16cex w16sdtdh w16sdtfl w16du wp14">
   <w:body>
     <w:p>
+      <w:pPr>
+        <w:jc w:val="center"/>
+        <w:rPr>
+          <w:rFonts w:asciiTheme="majorHAnsi" w:hAnsiTheme="majorHAnsi"/>
+          <w:color w:val="0B769F" w:themeColor="accent4" w:themeShade="BF"/>
+          <w:sz w:val="96"/>
+          <w:szCs w:val="96"/>
+        </w:rPr>
+      </w:pPr>
       <w:r>
-        <w:t>Dokumentation</w:t>
+        <w:rPr>
+          <w:rFonts w:asciiTheme="majorHAnsi" w:hAnsiTheme="majorHAnsi"/>
+          <w:color w:val="0B769F" w:themeColor="accent4" w:themeShade="BF"/>
+          <w:sz w:val="96"/>
+          <w:szCs w:val="96"/>
+        </w:rPr>
+        <w:t>W</w:t>
       </w:r>
-    </w:p>
-    <w:p/>
-    <w:p>
       <w:r>
-        <w:t>Hilfsmittel</w:t>
+        <w:rPr>
+          <w:rFonts w:asciiTheme="majorHAnsi" w:hAnsiTheme="majorHAnsi"/>
+          <w:color w:val="0B769F" w:themeColor="accent4" w:themeShade="BF"/>
+          <w:sz w:val="96"/>
+          <w:szCs w:val="96"/>
+        </w:rPr>
+        <w:t>ordBank</w:t>
       </w:r>
     </w:p>
     <w:p>
-      <w:hyperlink r:id="rId4" w:history="1">
+      <w:pPr>
+        <w:jc w:val="center"/>
+        <w:rPr>
+          <w:rFonts w:asciiTheme="majorHAnsi" w:hAnsiTheme="majorHAnsi"/>
+          <w:color w:val="0B769F" w:themeColor="accent4" w:themeShade="BF"/>
+          <w:sz w:val="56"/>
+          <w:szCs w:val="56"/>
+        </w:rPr>
+      </w:pPr>
+      <w:r>
+        <w:rPr>
+          <w:rFonts w:asciiTheme="majorHAnsi" w:hAnsiTheme="majorHAnsi"/>
+          <w:color w:val="0B769F" w:themeColor="accent4" w:themeShade="BF"/>
+          <w:sz w:val="56"/>
+          <w:szCs w:val="56"/>
+        </w:rPr>
+        <w:t>Projektdokumentation</w:t>
+      </w:r>
+    </w:p>
+    <w:p>
+      <w:pPr>
+        <w:jc w:val="center"/>
+        <w:rPr>
+          <w:rFonts w:asciiTheme="majorHAnsi" w:hAnsiTheme="majorHAnsi"/>
+          <w:color w:val="0B769F" w:themeColor="accent4" w:themeShade="BF"/>
+          <w:sz w:val="44"/>
+          <w:szCs w:val="44"/>
+        </w:rPr>
+      </w:pPr>
+      <w:r>
+        <w:rPr>
+          <w:rFonts w:asciiTheme="majorHAnsi" w:hAnsiTheme="majorHAnsi"/>
+          <w:color w:val="0B769F" w:themeColor="accent4" w:themeShade="BF"/>
+          <w:sz w:val="44"/>
+          <w:szCs w:val="44"/>
+        </w:rPr>
+        <w:t>Florina Osmani</w:t>
+      </w:r>
+    </w:p>
+    <w:p>
+      <w:pPr>
+        <w:jc w:val="center"/>
+        <w:rPr>
+          <w:rFonts w:asciiTheme="majorHAnsi" w:hAnsiTheme="majorHAnsi"/>
+          <w:color w:val="0B769F" w:themeColor="accent4" w:themeShade="BF"/>
+          <w:sz w:val="28"/>
+          <w:szCs w:val="28"/>
+        </w:rPr>
+      </w:pPr>
+      <w:r>
+        <w:rPr>
+          <w:rFonts w:asciiTheme="majorHAnsi" w:hAnsiTheme="majorHAnsi"/>
+          <w:color w:val="0B769F" w:themeColor="accent4" w:themeShade="BF"/>
+          <w:sz w:val="28"/>
+          <w:szCs w:val="28"/>
+        </w:rPr>
+        <w:t>Datum: 30.05.2026</w:t>
+      </w:r>
+    </w:p>
+    <w:p>
+      <w:pPr>
+        <w:jc w:val="center"/>
+        <w:rPr>
+          <w:rFonts w:asciiTheme="majorHAnsi" w:hAnsiTheme="majorHAnsi"/>
+          <w:color w:val="0B769F" w:themeColor="accent4" w:themeShade="BF"/>
+          <w:sz w:val="28"/>
+          <w:szCs w:val="28"/>
+        </w:rPr>
+      </w:pPr>
+      <w:r>
+        <w:rPr>
+          <w:rFonts w:asciiTheme="majorHAnsi" w:hAnsiTheme="majorHAnsi"/>
+          <w:color w:val="0B769F" w:themeColor="accent4" w:themeShade="BF"/>
+          <w:sz w:val="28"/>
+          <w:szCs w:val="28"/>
+        </w:rPr>
+        <w:t>Version: 1.0</w:t>
+      </w:r>
+    </w:p>
+    <w:p>
+      <w:pPr>
+        <w:jc w:val="center"/>
+        <w:rPr>
+          <w:color w:val="0B769F" w:themeColor="accent4" w:themeShade="BF"/>
+          <w:sz w:val="44"/>
+          <w:szCs w:val="44"/>
+        </w:rPr>
+      </w:pPr>
+    </w:p>
+    <w:p>
+      <w:pPr>
+        <w:jc w:val="center"/>
+        <w:rPr>
+          <w:color w:val="0B769F" w:themeColor="accent4" w:themeShade="BF"/>
+          <w:sz w:val="44"/>
+          <w:szCs w:val="44"/>
+        </w:rPr>
+        <w:sectPr>
+          <w:footerReference w:type="default" r:id="rId8"/>
+          <w:footerReference w:type="first" r:id="rId9"/>
+          <w:pgSz w:w="11906" w:h="16838"/>
+          <w:pgMar w:top="1440" w:right="1440" w:bottom="1440" w:left="1440" w:header="708" w:footer="708" w:gutter="0"/>
+          <w:cols w:space="708"/>
+          <w:titlePg/>
+          <w:docGrid w:linePitch="360"/>
+        </w:sectPr>
+      </w:pPr>
+      <w:r>
+        <w:rPr>
+          <w:color w:val="0B769F" w:themeColor="accent4" w:themeShade="BF"/>
+          <w:sz w:val="44"/>
+          <w:szCs w:val="44"/>
+        </w:rPr>
+        <w:drawing>
+          <wp:inline distT="0" distB="0" distL="0" distR="0" wp14:anchorId="03A9D9CE" wp14:editId="0FAC07A0">
+            <wp:extent cx="5731510" cy="4265930"/>
+            <wp:effectExtent l="19050" t="19050" r="21590" b="20320"/>
+            <wp:docPr id="1001615211" name="Picture 1" descr="jade,&#10;&#10;AI-generated content may be incorrect."/>
+            <wp:cNvGraphicFramePr>
+              <a:graphicFrameLocks xmlns:a="http://schemas.openxmlformats.org/drawingml/2006/main" noChangeAspect="1"/>
+            </wp:cNvGraphicFramePr>
+            <a:graphic xmlns:a="http://schemas.openxmlformats.org/drawingml/2006/main">
+              <a:graphicData uri="http://schemas.openxmlformats.org/drawingml/2006/picture">
+                <pic:pic xmlns:pic="http://schemas.openxmlformats.org/drawingml/2006/picture">
+                  <pic:nvPicPr>
+                    <pic:cNvPr id="1001615211" name="Picture 1" descr="jade,&#10;&#10;AI-generated content may be incorrect."/>
+                    <pic:cNvPicPr/>
+                  </pic:nvPicPr>
+                  <pic:blipFill>
+                    <a:blip r:embed="rId10"/>
+                    <a:stretch>
+                      <a:fillRect/>
+                    </a:stretch>
+                  </pic:blipFill>
+                  <pic:spPr>
+                    <a:xfrm>
+                      <a:off x="0" y="0"/>
+                      <a:ext cx="5731510" cy="4265930"/>
+                    </a:xfrm>
+                    <a:prstGeom prst="rect">
+                      <a:avLst/>
+                    </a:prstGeom>
+                    <a:ln w="19050">
+                      <a:solidFill>
+                        <a:schemeClr val="tx1"/>
+                      </a:solidFill>
+                      <a:extLst>
+                        <a:ext uri="{C807C97D-BFC1-408E-A445-0C87EB9F89A2}">
+                          <ask:lineSketchStyleProps xmlns:ask="http://schemas.microsoft.com/office/drawing/2018/sketchyshapes" sd="3469914885">
+                            <a:custGeom>
+                              <a:avLst/>
+                              <a:gdLst>
+                                <a:gd name="csX0" fmla="*/ 0 w 5731510"/>
+                                <a:gd name="csY0" fmla="*/ 0 h 4265930"/>
+                                <a:gd name="csX1" fmla="*/ 579519 w 5731510"/>
+                                <a:gd name="csY1" fmla="*/ 0 h 4265930"/>
+                                <a:gd name="csX2" fmla="*/ 1159039 w 5731510"/>
+                                <a:gd name="csY2" fmla="*/ 0 h 4265930"/>
+                                <a:gd name="csX3" fmla="*/ 1910503 w 5731510"/>
+                                <a:gd name="csY3" fmla="*/ 0 h 4265930"/>
+                                <a:gd name="csX4" fmla="*/ 2490023 w 5731510"/>
+                                <a:gd name="csY4" fmla="*/ 0 h 4265930"/>
+                                <a:gd name="csX5" fmla="*/ 3241487 w 5731510"/>
+                                <a:gd name="csY5" fmla="*/ 0 h 4265930"/>
+                                <a:gd name="csX6" fmla="*/ 3706376 w 5731510"/>
+                                <a:gd name="csY6" fmla="*/ 0 h 4265930"/>
+                                <a:gd name="csX7" fmla="*/ 4400526 w 5731510"/>
+                                <a:gd name="csY7" fmla="*/ 0 h 4265930"/>
+                                <a:gd name="csX8" fmla="*/ 4980045 w 5731510"/>
+                                <a:gd name="csY8" fmla="*/ 0 h 4265930"/>
+                                <a:gd name="csX9" fmla="*/ 5731510 w 5731510"/>
+                                <a:gd name="csY9" fmla="*/ 0 h 4265930"/>
+                                <a:gd name="csX10" fmla="*/ 5731510 w 5731510"/>
+                                <a:gd name="csY10" fmla="*/ 566759 h 4265930"/>
+                                <a:gd name="csX11" fmla="*/ 5731510 w 5731510"/>
+                                <a:gd name="csY11" fmla="*/ 1261496 h 4265930"/>
+                                <a:gd name="csX12" fmla="*/ 5731510 w 5731510"/>
+                                <a:gd name="csY12" fmla="*/ 1828256 h 4265930"/>
+                                <a:gd name="csX13" fmla="*/ 5731510 w 5731510"/>
+                                <a:gd name="csY13" fmla="*/ 2309696 h 4265930"/>
+                                <a:gd name="csX14" fmla="*/ 5731510 w 5731510"/>
+                                <a:gd name="csY14" fmla="*/ 3004434 h 4265930"/>
+                                <a:gd name="csX15" fmla="*/ 5731510 w 5731510"/>
+                                <a:gd name="csY15" fmla="*/ 3699171 h 4265930"/>
+                                <a:gd name="csX16" fmla="*/ 5731510 w 5731510"/>
+                                <a:gd name="csY16" fmla="*/ 4265930 h 4265930"/>
+                                <a:gd name="csX17" fmla="*/ 5266621 w 5731510"/>
+                                <a:gd name="csY17" fmla="*/ 4265930 h 4265930"/>
+                                <a:gd name="csX18" fmla="*/ 4572471 w 5731510"/>
+                                <a:gd name="csY18" fmla="*/ 4265930 h 4265930"/>
+                                <a:gd name="csX19" fmla="*/ 4107582 w 5731510"/>
+                                <a:gd name="csY19" fmla="*/ 4265930 h 4265930"/>
+                                <a:gd name="csX20" fmla="*/ 3356118 w 5731510"/>
+                                <a:gd name="csY20" fmla="*/ 4265930 h 4265930"/>
+                                <a:gd name="csX21" fmla="*/ 2891228 w 5731510"/>
+                                <a:gd name="csY21" fmla="*/ 4265930 h 4265930"/>
+                                <a:gd name="csX22" fmla="*/ 2369024 w 5731510"/>
+                                <a:gd name="csY22" fmla="*/ 4265930 h 4265930"/>
+                                <a:gd name="csX23" fmla="*/ 1789505 w 5731510"/>
+                                <a:gd name="csY23" fmla="*/ 4265930 h 4265930"/>
+                                <a:gd name="csX24" fmla="*/ 1267301 w 5731510"/>
+                                <a:gd name="csY24" fmla="*/ 4265930 h 4265930"/>
+                                <a:gd name="csX25" fmla="*/ 573151 w 5731510"/>
+                                <a:gd name="csY25" fmla="*/ 4265930 h 4265930"/>
+                                <a:gd name="csX26" fmla="*/ 0 w 5731510"/>
+                                <a:gd name="csY26" fmla="*/ 4265930 h 4265930"/>
+                                <a:gd name="csX27" fmla="*/ 0 w 5731510"/>
+                                <a:gd name="csY27" fmla="*/ 3571193 h 4265930"/>
+                                <a:gd name="csX28" fmla="*/ 0 w 5731510"/>
+                                <a:gd name="csY28" fmla="*/ 2919115 h 4265930"/>
+                                <a:gd name="csX29" fmla="*/ 0 w 5731510"/>
+                                <a:gd name="csY29" fmla="*/ 2352356 h 4265930"/>
+                                <a:gd name="csX30" fmla="*/ 0 w 5731510"/>
+                                <a:gd name="csY30" fmla="*/ 1828256 h 4265930"/>
+                                <a:gd name="csX31" fmla="*/ 0 w 5731510"/>
+                                <a:gd name="csY31" fmla="*/ 1261496 h 4265930"/>
+                                <a:gd name="csX32" fmla="*/ 0 w 5731510"/>
+                                <a:gd name="csY32" fmla="*/ 737396 h 4265930"/>
+                                <a:gd name="csX33" fmla="*/ 0 w 5731510"/>
+                                <a:gd name="csY33" fmla="*/ 0 h 4265930"/>
+                              </a:gdLst>
+                              <a:ahLst/>
+                              <a:cxnLst>
+                                <a:cxn ang="0">
+                                  <a:pos x="csX0" y="csY0"/>
+                                </a:cxn>
+                                <a:cxn ang="0">
+                                  <a:pos x="csX1" y="csY1"/>
+                                </a:cxn>
+                                <a:cxn ang="0">
+                                  <a:pos x="csX2" y="csY2"/>
+                                </a:cxn>
+                                <a:cxn ang="0">
+                                  <a:pos x="csX3" y="csY3"/>
+                                </a:cxn>
+                                <a:cxn ang="0">
+                                  <a:pos x="csX4" y="csY4"/>
+                                </a:cxn>
+                                <a:cxn ang="0">
+                                  <a:pos x="csX5" y="csY5"/>
+                                </a:cxn>
+                                <a:cxn ang="0">
+                                  <a:pos x="csX6" y="csY6"/>
+                                </a:cxn>
+                                <a:cxn ang="0">
+                                  <a:pos x="csX7" y="csY7"/>
+                                </a:cxn>
+                                <a:cxn ang="0">
+                                  <a:pos x="csX8" y="csY8"/>
+                                </a:cxn>
+                                <a:cxn ang="0">
+                                  <a:pos x="csX9" y="csY9"/>
+                                </a:cxn>
+                                <a:cxn ang="0">
+                                  <a:pos x="csX10" y="csY10"/>
+                                </a:cxn>
+                                <a:cxn ang="0">
+                                  <a:pos x="csX11" y="csY11"/>
+                                </a:cxn>
+                                <a:cxn ang="0">
+                                  <a:pos x="csX12" y="csY12"/>
+                                </a:cxn>
+                                <a:cxn ang="0">
+                                  <a:pos x="csX13" y="csY13"/>
+                                </a:cxn>
+                                <a:cxn ang="0">
+                                  <a:pos x="csX14" y="csY14"/>
+                                </a:cxn>
+                                <a:cxn ang="0">
+                                  <a:pos x="csX15" y="csY15"/>
+                                </a:cxn>
+                                <a:cxn ang="0">
+                                  <a:pos x="csX16" y="csY16"/>
+                                </a:cxn>
+                                <a:cxn ang="0">
+                                  <a:pos x="csX17" y="csY17"/>
+                                </a:cxn>
+                                <a:cxn ang="0">
+                                  <a:pos x="csX18" y="csY18"/>
+                                </a:cxn>
+                                <a:cxn ang="0">
+                                  <a:pos x="csX19" y="csY19"/>
+                                </a:cxn>
+                                <a:cxn ang="0">
+                                  <a:pos x="csX20" y="csY20"/>
+                                </a:cxn>
+                                <a:cxn ang="0">
+                                  <a:pos x="csX21" y="csY21"/>
+                                </a:cxn>
+                                <a:cxn ang="0">
+                                  <a:pos x="csX22" y="csY22"/>
+                                </a:cxn>
+                                <a:cxn ang="0">
+                                  <a:pos x="csX23" y="csY23"/>
+                                </a:cxn>
+                                <a:cxn ang="0">
+                                  <a:pos x="csX24" y="csY24"/>
+                                </a:cxn>
+                                <a:cxn ang="0">
+                                  <a:pos x="csX25" y="csY25"/>
+                                </a:cxn>
+                                <a:cxn ang="0">
+                                  <a:pos x="csX26" y="csY26"/>
+                                </a:cxn>
+                                <a:cxn ang="0">
+                                  <a:pos x="csX27" y="csY27"/>
+                                </a:cxn>
+                                <a:cxn ang="0">
+                                  <a:pos x="csX28" y="csY28"/>
+                                </a:cxn>
+                                <a:cxn ang="0">
+                                  <a:pos x="csX29" y="csY29"/>
+                                </a:cxn>
+                                <a:cxn ang="0">
+                                  <a:pos x="csX30" y="csY30"/>
+                                </a:cxn>
+                                <a:cxn ang="0">
+                                  <a:pos x="csX31" y="csY31"/>
+                                </a:cxn>
+                                <a:cxn ang="0">
+                                  <a:pos x="csX32" y="csY32"/>
+                                </a:cxn>
+                                <a:cxn ang="0">
+                                  <a:pos x="csX33" y="csY33"/>
+                                </a:cxn>
+                              </a:cxnLst>
+                              <a:rect l="l" t="t" r="r" b="b"/>
+                              <a:pathLst>
+                                <a:path w="5731510" h="4265930" fill="none" extrusionOk="0">
+                                  <a:moveTo>
+                                    <a:pt x="0" y="0"/>
+                                  </a:moveTo>
+                                  <a:cubicBezTo>
+                                    <a:pt x="173840" y="-28631"/>
+                                    <a:pt x="387876" y="-25094"/>
+                                    <a:pt x="579519" y="0"/>
+                                  </a:cubicBezTo>
+                                  <a:cubicBezTo>
+                                    <a:pt x="771162" y="25094"/>
+                                    <a:pt x="895973" y="1754"/>
+                                    <a:pt x="1159039" y="0"/>
+                                  </a:cubicBezTo>
+                                  <a:cubicBezTo>
+                                    <a:pt x="1422105" y="-1754"/>
+                                    <a:pt x="1637256" y="13707"/>
+                                    <a:pt x="1910503" y="0"/>
+                                  </a:cubicBezTo>
+                                  <a:cubicBezTo>
+                                    <a:pt x="2183750" y="-13707"/>
+                                    <a:pt x="2200696" y="-10288"/>
+                                    <a:pt x="2490023" y="0"/>
+                                  </a:cubicBezTo>
+                                  <a:cubicBezTo>
+                                    <a:pt x="2779350" y="10288"/>
+                                    <a:pt x="2899179" y="28709"/>
+                                    <a:pt x="3241487" y="0"/>
+                                  </a:cubicBezTo>
+                                  <a:cubicBezTo>
+                                    <a:pt x="3583795" y="-28709"/>
+                                    <a:pt x="3506245" y="20580"/>
+                                    <a:pt x="3706376" y="0"/>
+                                  </a:cubicBezTo>
+                                  <a:cubicBezTo>
+                                    <a:pt x="3906507" y="-20580"/>
+                                    <a:pt x="4229955" y="20793"/>
+                                    <a:pt x="4400526" y="0"/>
+                                  </a:cubicBezTo>
+                                  <a:cubicBezTo>
+                                    <a:pt x="4571097" y="-20793"/>
+                                    <a:pt x="4801962" y="17986"/>
+                                    <a:pt x="4980045" y="0"/>
+                                  </a:cubicBezTo>
+                                  <a:cubicBezTo>
+                                    <a:pt x="5158128" y="-17986"/>
+                                    <a:pt x="5398417" y="22344"/>
+                                    <a:pt x="5731510" y="0"/>
+                                  </a:cubicBezTo>
+                                  <a:cubicBezTo>
+                                    <a:pt x="5741522" y="140724"/>
+                                    <a:pt x="5736980" y="381191"/>
+                                    <a:pt x="5731510" y="566759"/>
+                                  </a:cubicBezTo>
+                                  <a:cubicBezTo>
+                                    <a:pt x="5726040" y="752327"/>
+                                    <a:pt x="5731992" y="914682"/>
+                                    <a:pt x="5731510" y="1261496"/>
+                                  </a:cubicBezTo>
+                                  <a:cubicBezTo>
+                                    <a:pt x="5731028" y="1608310"/>
+                                    <a:pt x="5705733" y="1712985"/>
+                                    <a:pt x="5731510" y="1828256"/>
+                                  </a:cubicBezTo>
+                                  <a:cubicBezTo>
+                                    <a:pt x="5757287" y="1943527"/>
+                                    <a:pt x="5739851" y="2168217"/>
+                                    <a:pt x="5731510" y="2309696"/>
+                                  </a:cubicBezTo>
+                                  <a:cubicBezTo>
+                                    <a:pt x="5723169" y="2451175"/>
+                                    <a:pt x="5747042" y="2828044"/>
+                                    <a:pt x="5731510" y="3004434"/>
+                                  </a:cubicBezTo>
+                                  <a:cubicBezTo>
+                                    <a:pt x="5715978" y="3180824"/>
+                                    <a:pt x="5738849" y="3377545"/>
+                                    <a:pt x="5731510" y="3699171"/>
+                                  </a:cubicBezTo>
+                                  <a:cubicBezTo>
+                                    <a:pt x="5724171" y="4020797"/>
+                                    <a:pt x="5750769" y="4064213"/>
+                                    <a:pt x="5731510" y="4265930"/>
+                                  </a:cubicBezTo>
+                                  <a:cubicBezTo>
+                                    <a:pt x="5621408" y="4245928"/>
+                                    <a:pt x="5359695" y="4286781"/>
+                                    <a:pt x="5266621" y="4265930"/>
+                                  </a:cubicBezTo>
+                                  <a:cubicBezTo>
+                                    <a:pt x="5173547" y="4245079"/>
+                                    <a:pt x="4721598" y="4243359"/>
+                                    <a:pt x="4572471" y="4265930"/>
+                                  </a:cubicBezTo>
+                                  <a:cubicBezTo>
+                                    <a:pt x="4423344" y="4288502"/>
+                                    <a:pt x="4258463" y="4270442"/>
+                                    <a:pt x="4107582" y="4265930"/>
+                                  </a:cubicBezTo>
+                                  <a:cubicBezTo>
+                                    <a:pt x="3956701" y="4261418"/>
+                                    <a:pt x="3580545" y="4263173"/>
+                                    <a:pt x="3356118" y="4265930"/>
+                                  </a:cubicBezTo>
+                                  <a:cubicBezTo>
+                                    <a:pt x="3131691" y="4268687"/>
+                                    <a:pt x="3069565" y="4272145"/>
+                                    <a:pt x="2891228" y="4265930"/>
+                                  </a:cubicBezTo>
+                                  <a:cubicBezTo>
+                                    <a:pt x="2712891" y="4259716"/>
+                                    <a:pt x="2569111" y="4257199"/>
+                                    <a:pt x="2369024" y="4265930"/>
+                                  </a:cubicBezTo>
+                                  <a:cubicBezTo>
+                                    <a:pt x="2168937" y="4274661"/>
+                                    <a:pt x="2055437" y="4254317"/>
+                                    <a:pt x="1789505" y="4265930"/>
+                                  </a:cubicBezTo>
+                                  <a:cubicBezTo>
+                                    <a:pt x="1523573" y="4277543"/>
+                                    <a:pt x="1515927" y="4254806"/>
+                                    <a:pt x="1267301" y="4265930"/>
+                                  </a:cubicBezTo>
+                                  <a:cubicBezTo>
+                                    <a:pt x="1018675" y="4277054"/>
+                                    <a:pt x="919996" y="4292257"/>
+                                    <a:pt x="573151" y="4265930"/>
+                                  </a:cubicBezTo>
+                                  <a:cubicBezTo>
+                                    <a:pt x="226306" y="4239604"/>
+                                    <a:pt x="146398" y="4237872"/>
+                                    <a:pt x="0" y="4265930"/>
+                                  </a:cubicBezTo>
+                                  <a:cubicBezTo>
+                                    <a:pt x="20289" y="3953128"/>
+                                    <a:pt x="4873" y="3857175"/>
+                                    <a:pt x="0" y="3571193"/>
+                                  </a:cubicBezTo>
+                                  <a:cubicBezTo>
+                                    <a:pt x="-4873" y="3285211"/>
+                                    <a:pt x="14675" y="3185317"/>
+                                    <a:pt x="0" y="2919115"/>
+                                  </a:cubicBezTo>
+                                  <a:cubicBezTo>
+                                    <a:pt x="-14675" y="2652913"/>
+                                    <a:pt x="-27560" y="2554340"/>
+                                    <a:pt x="0" y="2352356"/>
+                                  </a:cubicBezTo>
+                                  <a:cubicBezTo>
+                                    <a:pt x="27560" y="2150372"/>
+                                    <a:pt x="-9418" y="1998272"/>
+                                    <a:pt x="0" y="1828256"/>
+                                  </a:cubicBezTo>
+                                  <a:cubicBezTo>
+                                    <a:pt x="9418" y="1658240"/>
+                                    <a:pt x="24335" y="1483127"/>
+                                    <a:pt x="0" y="1261496"/>
+                                  </a:cubicBezTo>
+                                  <a:cubicBezTo>
+                                    <a:pt x="-24335" y="1039865"/>
+                                    <a:pt x="8096" y="900123"/>
+                                    <a:pt x="0" y="737396"/>
+                                  </a:cubicBezTo>
+                                  <a:cubicBezTo>
+                                    <a:pt x="-8096" y="574669"/>
+                                    <a:pt x="2363" y="150216"/>
+                                    <a:pt x="0" y="0"/>
+                                  </a:cubicBezTo>
+                                  <a:close/>
+                                </a:path>
+                                <a:path w="5731510" h="4265930" stroke="0" extrusionOk="0">
+                                  <a:moveTo>
+                                    <a:pt x="0" y="0"/>
+                                  </a:moveTo>
+                                  <a:cubicBezTo>
+                                    <a:pt x="249316" y="-9151"/>
+                                    <a:pt x="369121" y="26126"/>
+                                    <a:pt x="636834" y="0"/>
+                                  </a:cubicBezTo>
+                                  <a:cubicBezTo>
+                                    <a:pt x="904547" y="-26126"/>
+                                    <a:pt x="1097698" y="-12039"/>
+                                    <a:pt x="1388299" y="0"/>
+                                  </a:cubicBezTo>
+                                  <a:cubicBezTo>
+                                    <a:pt x="1678900" y="12039"/>
+                                    <a:pt x="1696500" y="-7862"/>
+                                    <a:pt x="1853188" y="0"/>
+                                  </a:cubicBezTo>
+                                  <a:cubicBezTo>
+                                    <a:pt x="2009876" y="7862"/>
+                                    <a:pt x="2272225" y="-15193"/>
+                                    <a:pt x="2490023" y="0"/>
+                                  </a:cubicBezTo>
+                                  <a:cubicBezTo>
+                                    <a:pt x="2707821" y="15193"/>
+                                    <a:pt x="2798162" y="2181"/>
+                                    <a:pt x="3069542" y="0"/>
+                                  </a:cubicBezTo>
+                                  <a:cubicBezTo>
+                                    <a:pt x="3340922" y="-2181"/>
+                                    <a:pt x="3457967" y="-3280"/>
+                                    <a:pt x="3763692" y="0"/>
+                                  </a:cubicBezTo>
+                                  <a:cubicBezTo>
+                                    <a:pt x="4069417" y="3280"/>
+                                    <a:pt x="4141404" y="-8771"/>
+                                    <a:pt x="4343211" y="0"/>
+                                  </a:cubicBezTo>
+                                  <a:cubicBezTo>
+                                    <a:pt x="4545018" y="8771"/>
+                                    <a:pt x="4865819" y="27618"/>
+                                    <a:pt x="5037360" y="0"/>
+                                  </a:cubicBezTo>
+                                  <a:cubicBezTo>
+                                    <a:pt x="5208901" y="-27618"/>
+                                    <a:pt x="5472303" y="21568"/>
+                                    <a:pt x="5731510" y="0"/>
+                                  </a:cubicBezTo>
+                                  <a:cubicBezTo>
+                                    <a:pt x="5720916" y="335070"/>
+                                    <a:pt x="5749101" y="480783"/>
+                                    <a:pt x="5731510" y="694737"/>
+                                  </a:cubicBezTo>
+                                  <a:cubicBezTo>
+                                    <a:pt x="5713919" y="908691"/>
+                                    <a:pt x="5753226" y="959573"/>
+                                    <a:pt x="5731510" y="1176178"/>
+                                  </a:cubicBezTo>
+                                  <a:cubicBezTo>
+                                    <a:pt x="5709794" y="1392783"/>
+                                    <a:pt x="5703504" y="1652234"/>
+                                    <a:pt x="5731510" y="1785596"/>
+                                  </a:cubicBezTo>
+                                  <a:cubicBezTo>
+                                    <a:pt x="5759516" y="1918958"/>
+                                    <a:pt x="5743358" y="2102365"/>
+                                    <a:pt x="5731510" y="2267037"/>
+                                  </a:cubicBezTo>
+                                  <a:cubicBezTo>
+                                    <a:pt x="5719662" y="2431709"/>
+                                    <a:pt x="5754183" y="2617153"/>
+                                    <a:pt x="5731510" y="2748478"/>
+                                  </a:cubicBezTo>
+                                  <a:cubicBezTo>
+                                    <a:pt x="5708837" y="2879803"/>
+                                    <a:pt x="5725503" y="3190116"/>
+                                    <a:pt x="5731510" y="3400556"/>
+                                  </a:cubicBezTo>
+                                  <a:cubicBezTo>
+                                    <a:pt x="5737517" y="3610996"/>
+                                    <a:pt x="5748940" y="3839548"/>
+                                    <a:pt x="5731510" y="4265930"/>
+                                  </a:cubicBezTo>
+                                  <a:cubicBezTo>
+                                    <a:pt x="5565871" y="4241678"/>
+                                    <a:pt x="5312860" y="4280240"/>
+                                    <a:pt x="5151991" y="4265930"/>
+                                  </a:cubicBezTo>
+                                  <a:cubicBezTo>
+                                    <a:pt x="4991122" y="4251620"/>
+                                    <a:pt x="4767961" y="4295310"/>
+                                    <a:pt x="4400526" y="4265930"/>
+                                  </a:cubicBezTo>
+                                  <a:cubicBezTo>
+                                    <a:pt x="4033092" y="4236550"/>
+                                    <a:pt x="4057835" y="4242082"/>
+                                    <a:pt x="3821007" y="4265930"/>
+                                  </a:cubicBezTo>
+                                  <a:cubicBezTo>
+                                    <a:pt x="3584179" y="4289778"/>
+                                    <a:pt x="3450251" y="4244444"/>
+                                    <a:pt x="3184172" y="4265930"/>
+                                  </a:cubicBezTo>
+                                  <a:cubicBezTo>
+                                    <a:pt x="2918093" y="4287416"/>
+                                    <a:pt x="2770427" y="4254456"/>
+                                    <a:pt x="2661968" y="4265930"/>
+                                  </a:cubicBezTo>
+                                  <a:cubicBezTo>
+                                    <a:pt x="2553509" y="4277404"/>
+                                    <a:pt x="2253292" y="4237568"/>
+                                    <a:pt x="2082449" y="4265930"/>
+                                  </a:cubicBezTo>
+                                  <a:cubicBezTo>
+                                    <a:pt x="1911606" y="4294292"/>
+                                    <a:pt x="1701532" y="4244913"/>
+                                    <a:pt x="1560244" y="4265930"/>
+                                  </a:cubicBezTo>
+                                  <a:cubicBezTo>
+                                    <a:pt x="1418957" y="4286947"/>
+                                    <a:pt x="1095243" y="4238107"/>
+                                    <a:pt x="923410" y="4265930"/>
+                                  </a:cubicBezTo>
+                                  <a:cubicBezTo>
+                                    <a:pt x="751577" y="4293753"/>
+                                    <a:pt x="449249" y="4225016"/>
+                                    <a:pt x="0" y="4265930"/>
+                                  </a:cubicBezTo>
+                                  <a:cubicBezTo>
+                                    <a:pt x="-30127" y="4093413"/>
+                                    <a:pt x="25137" y="3862354"/>
+                                    <a:pt x="0" y="3613852"/>
+                                  </a:cubicBezTo>
+                                  <a:cubicBezTo>
+                                    <a:pt x="-25137" y="3365350"/>
+                                    <a:pt x="1136" y="3188692"/>
+                                    <a:pt x="0" y="2961774"/>
+                                  </a:cubicBezTo>
+                                  <a:cubicBezTo>
+                                    <a:pt x="-1136" y="2734856"/>
+                                    <a:pt x="-25121" y="2610765"/>
+                                    <a:pt x="0" y="2437674"/>
+                                  </a:cubicBezTo>
+                                  <a:cubicBezTo>
+                                    <a:pt x="25121" y="2264583"/>
+                                    <a:pt x="22282" y="2026551"/>
+                                    <a:pt x="0" y="1913574"/>
+                                  </a:cubicBezTo>
+                                  <a:cubicBezTo>
+                                    <a:pt x="-22282" y="1800597"/>
+                                    <a:pt x="-2075" y="1529427"/>
+                                    <a:pt x="0" y="1432134"/>
+                                  </a:cubicBezTo>
+                                  <a:cubicBezTo>
+                                    <a:pt x="2075" y="1334841"/>
+                                    <a:pt x="-17282" y="1080462"/>
+                                    <a:pt x="0" y="865374"/>
+                                  </a:cubicBezTo>
+                                  <a:cubicBezTo>
+                                    <a:pt x="17282" y="650286"/>
+                                    <a:pt x="25133" y="311244"/>
+                                    <a:pt x="0" y="0"/>
+                                  </a:cubicBezTo>
+                                  <a:close/>
+                                </a:path>
+                              </a:pathLst>
+                            </a:custGeom>
+                            <ask:type>
+                              <ask:lineSketchNone/>
+                            </ask:type>
+                          </ask:lineSketchStyleProps>
+                        </a:ext>
+                      </a:extLst>
+                    </a:ln>
+                  </pic:spPr>
+                </pic:pic>
+              </a:graphicData>
+            </a:graphic>
+          </wp:inline>
+        </w:drawing>
+      </w:r>
+    </w:p>
+    <w:sdt>
+      <w:sdtPr>
+        <w:rPr>
+          <w:lang w:val="de-CH"/>
+        </w:rPr>
+        <w:id w:val="1061686563"/>
+        <w:docPartObj>
+          <w:docPartGallery w:val="Table of Contents"/>
+          <w:docPartUnique/>
+        </w:docPartObj>
+      </w:sdtPr>
+      <w:sdtEndPr>
+        <w:rPr>
+          <w:rFonts w:asciiTheme="minorHAnsi" w:eastAsiaTheme="minorHAnsi" w:hAnsiTheme="minorHAnsi" w:cstheme="minorBidi"/>
+          <w:b/>
+          <w:bCs/>
+          <w:noProof/>
+          <w:color w:val="auto"/>
+          <w:kern w:val="2"/>
+          <w:sz w:val="24"/>
+          <w:szCs w:val="24"/>
+          <w14:ligatures w14:val="standardContextual"/>
+        </w:rPr>
+      </w:sdtEndPr>
+      <w:sdtContent>
+        <w:p>
+          <w:pPr>
+            <w:pStyle w:val="TOCHeading"/>
+            <w:rPr>
+              <w:lang w:val="de-CH"/>
+            </w:rPr>
+          </w:pPr>
+          <w:r>
+            <w:rPr>
+              <w:lang w:val="de-CH"/>
+            </w:rPr>
+            <w:t>Inhaltsverzeichnis</w:t>
+          </w:r>
+        </w:p>
+        <w:p>
+          <w:pPr>
+            <w:pStyle w:val="TOC1"/>
+            <w:tabs>
+              <w:tab w:val="right" w:leader="dot" w:pos="9016"/>
+            </w:tabs>
+            <w:rPr>
+              <w:noProof/>
+            </w:rPr>
+          </w:pPr>
+          <w:r>
+            <w:fldChar w:fldCharType="begin"/>
+          </w:r>
+          <w:r>
+            <w:instrText xml:space="preserve"> TOC \o "1-3" \h \z \u </w:instrText>
+          </w:r>
+          <w:r>
+            <w:fldChar w:fldCharType="separate"/>
+          </w:r>
+          <w:hyperlink w:anchor="_Toc231032600" w:history="1">
+            <w:r>
+              <w:rPr>
+                <w:rStyle w:val="Hyperlink"/>
+                <w:noProof/>
+              </w:rPr>
+              <w:t>Projektidee</w:t>
+            </w:r>
+            <w:r>
+              <w:rPr>
+                <w:noProof/>
+                <w:webHidden/>
+              </w:rPr>
+              <w:tab/>
+            </w:r>
+            <w:r>
+              <w:rPr>
+                <w:noProof/>
+                <w:webHidden/>
+              </w:rPr>
+              <w:fldChar w:fldCharType="begin"/>
+            </w:r>
+            <w:r>
+              <w:rPr>
+                <w:noProof/>
+                <w:webHidden/>
+              </w:rPr>
+              <w:instrText xml:space="preserve"> PAGEREF _Toc231032600 \h </w:instrText>
+            </w:r>
+            <w:r>
+              <w:rPr>
+                <w:noProof/>
+                <w:webHidden/>
+              </w:rPr>
+            </w:r>
+            <w:r>
+              <w:rPr>
+                <w:noProof/>
+                <w:webHidden/>
+              </w:rPr>
+              <w:fldChar w:fldCharType="separate"/>
+            </w:r>
+            <w:r>
+              <w:rPr>
+                <w:noProof/>
+                <w:webHidden/>
+              </w:rPr>
+              <w:t>1</w:t>
+            </w:r>
+            <w:r>
+              <w:rPr>
+                <w:noProof/>
+                <w:webHidden/>
+              </w:rPr>
+              <w:fldChar w:fldCharType="end"/>
+            </w:r>
+          </w:hyperlink>
+        </w:p>
+        <w:p>
+          <w:pPr>
+            <w:pStyle w:val="TOC1"/>
+            <w:tabs>
+              <w:tab w:val="right" w:leader="dot" w:pos="9016"/>
+            </w:tabs>
+            <w:rPr>
+              <w:noProof/>
+            </w:rPr>
+          </w:pPr>
+          <w:hyperlink w:anchor="_Toc231032601" w:history="1">
+            <w:r>
+              <w:rPr>
+                <w:rStyle w:val="Hyperlink"/>
+                <w:noProof/>
+              </w:rPr>
+              <w:t>Anforderungskatalog</w:t>
+            </w:r>
+            <w:r>
+              <w:rPr>
+                <w:noProof/>
+                <w:webHidden/>
+              </w:rPr>
+              <w:tab/>
+            </w:r>
+            <w:r>
+              <w:rPr>
+                <w:noProof/>
+                <w:webHidden/>
+              </w:rPr>
+              <w:fldChar w:fldCharType="begin"/>
+            </w:r>
+            <w:r>
+              <w:rPr>
+                <w:noProof/>
+                <w:webHidden/>
+              </w:rPr>
+              <w:instrText xml:space="preserve"> PAGEREF _Toc231032601 \h </w:instrText>
+            </w:r>
+            <w:r>
+              <w:rPr>
+                <w:noProof/>
+                <w:webHidden/>
+              </w:rPr>
+            </w:r>
+            <w:r>
+              <w:rPr>
+                <w:noProof/>
+                <w:webHidden/>
+              </w:rPr>
+              <w:fldChar w:fldCharType="separate"/>
+            </w:r>
+            <w:r>
+              <w:rPr>
+                <w:noProof/>
+                <w:webHidden/>
+              </w:rPr>
+              <w:t>1</w:t>
+            </w:r>
+            <w:r>
+              <w:rPr>
+                <w:noProof/>
+                <w:webHidden/>
+              </w:rPr>
+              <w:fldChar w:fldCharType="end"/>
+            </w:r>
+          </w:hyperlink>
+        </w:p>
+        <w:p>
+          <w:pPr>
+            <w:pStyle w:val="TOC1"/>
+            <w:tabs>
+              <w:tab w:val="right" w:leader="dot" w:pos="9016"/>
+            </w:tabs>
+            <w:rPr>
+              <w:noProof/>
+            </w:rPr>
+          </w:pPr>
+          <w:hyperlink w:anchor="_Toc231032602" w:history="1">
+            <w:r>
+              <w:rPr>
+                <w:rStyle w:val="Hyperlink"/>
+                <w:noProof/>
+              </w:rPr>
+              <w:t>Klassendiagramm</w:t>
+            </w:r>
+            <w:r>
+              <w:rPr>
+                <w:noProof/>
+                <w:webHidden/>
+              </w:rPr>
+              <w:tab/>
+            </w:r>
+            <w:r>
+              <w:rPr>
+                <w:noProof/>
+                <w:webHidden/>
+              </w:rPr>
+              <w:fldChar w:fldCharType="begin"/>
+            </w:r>
+            <w:r>
+              <w:rPr>
+                <w:noProof/>
+                <w:webHidden/>
+              </w:rPr>
+              <w:instrText xml:space="preserve"> PAGEREF _Toc231032602 \h </w:instrText>
+            </w:r>
+            <w:r>
+              <w:rPr>
+                <w:noProof/>
+                <w:webHidden/>
+              </w:rPr>
+            </w:r>
+            <w:r>
+              <w:rPr>
+                <w:noProof/>
+                <w:webHidden/>
+              </w:rPr>
+              <w:fldChar w:fldCharType="separate"/>
+            </w:r>
+            <w:r>
+              <w:rPr>
+                <w:noProof/>
+                <w:webHidden/>
+              </w:rPr>
+              <w:t>1</w:t>
+            </w:r>
+            <w:r>
+              <w:rPr>
+                <w:noProof/>
+                <w:webHidden/>
+              </w:rPr>
+              <w:fldChar w:fldCharType="end"/>
+            </w:r>
+          </w:hyperlink>
+        </w:p>
+        <w:p>
+          <w:pPr>
+            <w:pStyle w:val="TOC1"/>
+            <w:tabs>
+              <w:tab w:val="right" w:leader="dot" w:pos="9016"/>
+            </w:tabs>
+            <w:rPr>
+              <w:noProof/>
+            </w:rPr>
+          </w:pPr>
+          <w:hyperlink w:anchor="_Toc231032603" w:history="1">
+            <w:r>
+              <w:rPr>
+                <w:rStyle w:val="Hyperlink"/>
+                <w:noProof/>
+              </w:rPr>
+              <w:t>Storyboard</w:t>
+            </w:r>
+            <w:r>
+              <w:rPr>
+                <w:noProof/>
+                <w:webHidden/>
+              </w:rPr>
+              <w:tab/>
+            </w:r>
+            <w:r>
+              <w:rPr>
+                <w:noProof/>
+                <w:webHidden/>
+              </w:rPr>
+              <w:fldChar w:fldCharType="begin"/>
+            </w:r>
+            <w:r>
+              <w:rPr>
+                <w:noProof/>
+                <w:webHidden/>
+              </w:rPr>
+              <w:instrText xml:space="preserve"> PAGEREF _Toc231032603 \h </w:instrText>
+            </w:r>
+            <w:r>
+              <w:rPr>
+                <w:noProof/>
+                <w:webHidden/>
+              </w:rPr>
+            </w:r>
+            <w:r>
+              <w:rPr>
+                <w:noProof/>
+                <w:webHidden/>
+              </w:rPr>
+              <w:fldChar w:fldCharType="separate"/>
+            </w:r>
+            <w:r>
+              <w:rPr>
+                <w:noProof/>
+                <w:webHidden/>
+              </w:rPr>
+              <w:t>1</w:t>
+            </w:r>
+            <w:r>
+              <w:rPr>
+                <w:noProof/>
+                <w:webHidden/>
+              </w:rPr>
+              <w:fldChar w:fldCharType="end"/>
+            </w:r>
+          </w:hyperlink>
+        </w:p>
+        <w:p>
+          <w:pPr>
+            <w:pStyle w:val="TOC1"/>
+            <w:tabs>
+              <w:tab w:val="right" w:leader="dot" w:pos="9016"/>
+            </w:tabs>
+            <w:rPr>
+              <w:noProof/>
+            </w:rPr>
+          </w:pPr>
+          <w:hyperlink w:anchor="_Toc231032604" w:history="1">
+            <w:r>
+              <w:rPr>
+                <w:rStyle w:val="Hyperlink"/>
+                <w:noProof/>
+              </w:rPr>
+              <w:t>Screen-Mockups</w:t>
+            </w:r>
+            <w:r>
+              <w:rPr>
+                <w:noProof/>
+                <w:webHidden/>
+              </w:rPr>
+              <w:tab/>
+            </w:r>
+            <w:r>
+              <w:rPr>
+                <w:noProof/>
+                <w:webHidden/>
+              </w:rPr>
+              <w:fldChar w:fldCharType="begin"/>
+            </w:r>
+            <w:r>
+              <w:rPr>
+                <w:noProof/>
+                <w:webHidden/>
+              </w:rPr>
+              <w:instrText xml:space="preserve"> PAGEREF _Toc231032604 \h </w:instrText>
+            </w:r>
+            <w:r>
+              <w:rPr>
+                <w:noProof/>
+                <w:webHidden/>
+              </w:rPr>
+            </w:r>
+            <w:r>
+              <w:rPr>
+                <w:noProof/>
+                <w:webHidden/>
+              </w:rPr>
+              <w:fldChar w:fldCharType="separate"/>
+            </w:r>
+            <w:r>
+              <w:rPr>
+                <w:noProof/>
+                <w:webHidden/>
+              </w:rPr>
+              <w:t>1</w:t>
+            </w:r>
+            <w:r>
+              <w:rPr>
+                <w:noProof/>
+                <w:webHidden/>
+              </w:rPr>
+              <w:fldChar w:fldCharType="end"/>
+            </w:r>
+          </w:hyperlink>
+        </w:p>
+        <w:p>
+          <w:pPr>
+            <w:pStyle w:val="TOC1"/>
+            <w:tabs>
+              <w:tab w:val="right" w:leader="dot" w:pos="9016"/>
+            </w:tabs>
+            <w:rPr>
+              <w:noProof/>
+            </w:rPr>
+          </w:pPr>
+          <w:hyperlink w:anchor="_Toc231032605" w:history="1">
+            <w:r>
+              <w:rPr>
+                <w:rStyle w:val="Hyperlink"/>
+                <w:noProof/>
+              </w:rPr>
+              <w:t>REST-Schnittstellen</w:t>
+            </w:r>
+            <w:r>
+              <w:rPr>
+                <w:noProof/>
+                <w:webHidden/>
+              </w:rPr>
+              <w:tab/>
+            </w:r>
+            <w:r>
+              <w:rPr>
+                <w:noProof/>
+                <w:webHidden/>
+              </w:rPr>
+              <w:fldChar w:fldCharType="begin"/>
+            </w:r>
+            <w:r>
+              <w:rPr>
+                <w:noProof/>
+                <w:webHidden/>
+              </w:rPr>
+              <w:instrText xml:space="preserve"> PAGEREF _Toc231032605 \h </w:instrText>
+            </w:r>
+            <w:r>
+              <w:rPr>
+                <w:noProof/>
+                <w:webHidden/>
+              </w:rPr>
+            </w:r>
+            <w:r>
+              <w:rPr>
+                <w:noProof/>
+                <w:webHidden/>
+              </w:rPr>
+              <w:fldChar w:fldCharType="separate"/>
+            </w:r>
+            <w:r>
+              <w:rPr>
+                <w:noProof/>
+                <w:webHidden/>
+              </w:rPr>
+              <w:t>1</w:t>
+            </w:r>
+            <w:r>
+              <w:rPr>
+                <w:noProof/>
+                <w:webHidden/>
+              </w:rPr>
+              <w:fldChar w:fldCharType="end"/>
+            </w:r>
+          </w:hyperlink>
+        </w:p>
+        <w:p>
+          <w:pPr>
+            <w:pStyle w:val="TOC1"/>
+            <w:tabs>
+              <w:tab w:val="right" w:leader="dot" w:pos="9016"/>
+            </w:tabs>
+            <w:rPr>
+              <w:noProof/>
+            </w:rPr>
+          </w:pPr>
+          <w:hyperlink w:anchor="_Toc231032606" w:history="1">
+            <w:r>
+              <w:rPr>
+                <w:rStyle w:val="Hyperlink"/>
+                <w:noProof/>
+              </w:rPr>
+              <w:t>Testplan</w:t>
+            </w:r>
+            <w:r>
+              <w:rPr>
+                <w:noProof/>
+                <w:webHidden/>
+              </w:rPr>
+              <w:tab/>
+            </w:r>
+            <w:r>
+              <w:rPr>
+                <w:noProof/>
+                <w:webHidden/>
+              </w:rPr>
+              <w:fldChar w:fldCharType="begin"/>
+            </w:r>
+            <w:r>
+              <w:rPr>
+                <w:noProof/>
+                <w:webHidden/>
+              </w:rPr>
+              <w:instrText xml:space="preserve"> PAGEREF _Toc231032606 \h </w:instrText>
+            </w:r>
+            <w:r>
+              <w:rPr>
+                <w:noProof/>
+                <w:webHidden/>
+              </w:rPr>
+            </w:r>
+            <w:r>
+              <w:rPr>
+                <w:noProof/>
+                <w:webHidden/>
+              </w:rPr>
+              <w:fldChar w:fldCharType="separate"/>
+            </w:r>
+            <w:r>
+              <w:rPr>
+                <w:noProof/>
+                <w:webHidden/>
+              </w:rPr>
+              <w:t>1</w:t>
+            </w:r>
+            <w:r>
+              <w:rPr>
+                <w:noProof/>
+                <w:webHidden/>
+              </w:rPr>
+              <w:fldChar w:fldCharType="end"/>
+            </w:r>
+          </w:hyperlink>
+        </w:p>
+        <w:p>
+          <w:pPr>
+            <w:pStyle w:val="TOC1"/>
+            <w:tabs>
+              <w:tab w:val="right" w:leader="dot" w:pos="9016"/>
+            </w:tabs>
+            <w:rPr>
+              <w:noProof/>
+            </w:rPr>
+          </w:pPr>
+          <w:hyperlink w:anchor="_Toc231032607" w:history="1">
+            <w:r>
+              <w:rPr>
+                <w:rStyle w:val="Hyperlink"/>
+                <w:noProof/>
+              </w:rPr>
+              <w:t>Testergebnisse</w:t>
+            </w:r>
+            <w:r>
+              <w:rPr>
+                <w:noProof/>
+                <w:webHidden/>
+              </w:rPr>
+              <w:tab/>
+            </w:r>
+            <w:r>
+              <w:rPr>
+                <w:noProof/>
+                <w:webHidden/>
+              </w:rPr>
+              <w:fldChar w:fldCharType="begin"/>
+            </w:r>
+            <w:r>
+              <w:rPr>
+                <w:noProof/>
+                <w:webHidden/>
+              </w:rPr>
+              <w:instrText xml:space="preserve"> PAGEREF _Toc231032607 \h </w:instrText>
+            </w:r>
+            <w:r>
+              <w:rPr>
+                <w:noProof/>
+                <w:webHidden/>
+              </w:rPr>
+            </w:r>
+            <w:r>
+              <w:rPr>
+                <w:noProof/>
+                <w:webHidden/>
+              </w:rPr>
+              <w:fldChar w:fldCharType="separate"/>
+            </w:r>
+            <w:r>
+              <w:rPr>
+                <w:noProof/>
+                <w:webHidden/>
+              </w:rPr>
+              <w:t>1</w:t>
+            </w:r>
+            <w:r>
+              <w:rPr>
+                <w:noProof/>
+                <w:webHidden/>
+              </w:rPr>
+              <w:fldChar w:fldCharType="end"/>
+            </w:r>
+          </w:hyperlink>
+        </w:p>
+        <w:p>
+          <w:pPr>
+            <w:pStyle w:val="TOC1"/>
+            <w:tabs>
+              <w:tab w:val="right" w:leader="dot" w:pos="9016"/>
+            </w:tabs>
+            <w:rPr>
+              <w:noProof/>
+            </w:rPr>
+          </w:pPr>
+          <w:hyperlink w:anchor="_Toc231032608" w:history="1">
+            <w:r>
+              <w:rPr>
+                <w:rStyle w:val="Hyperlink"/>
+                <w:noProof/>
+              </w:rPr>
+              <w:t>Installationsanleitung</w:t>
+            </w:r>
+            <w:r>
+              <w:rPr>
+                <w:noProof/>
+                <w:webHidden/>
+              </w:rPr>
+              <w:tab/>
+            </w:r>
+            <w:r>
+              <w:rPr>
+                <w:noProof/>
+                <w:webHidden/>
+              </w:rPr>
+              <w:fldChar w:fldCharType="begin"/>
+            </w:r>
+            <w:r>
+              <w:rPr>
+                <w:noProof/>
+                <w:webHidden/>
+              </w:rPr>
+              <w:instrText xml:space="preserve"> PAGEREF _Toc231032608 \h </w:instrText>
+            </w:r>
+            <w:r>
+              <w:rPr>
+                <w:noProof/>
+                <w:webHidden/>
+              </w:rPr>
+            </w:r>
+            <w:r>
+              <w:rPr>
+                <w:noProof/>
+                <w:webHidden/>
+              </w:rPr>
+              <w:fldChar w:fldCharType="separate"/>
+            </w:r>
+            <w:r>
+              <w:rPr>
+                <w:noProof/>
+                <w:webHidden/>
+              </w:rPr>
+              <w:t>1</w:t>
+            </w:r>
+            <w:r>
+              <w:rPr>
+                <w:noProof/>
+                <w:webHidden/>
+              </w:rPr>
+              <w:fldChar w:fldCharType="end"/>
+            </w:r>
+          </w:hyperlink>
+        </w:p>
+        <w:p>
+          <w:pPr>
+            <w:pStyle w:val="TOC1"/>
+            <w:tabs>
+              <w:tab w:val="right" w:leader="dot" w:pos="9016"/>
+            </w:tabs>
+            <w:rPr>
+              <w:noProof/>
+            </w:rPr>
+          </w:pPr>
+          <w:hyperlink w:anchor="_Toc231032609" w:history="1">
+            <w:r>
+              <w:rPr>
+                <w:rStyle w:val="Hyperlink"/>
+                <w:noProof/>
+              </w:rPr>
+              <w:t>Hilfestellungen</w:t>
+            </w:r>
+            <w:r>
+              <w:rPr>
+                <w:noProof/>
+                <w:webHidden/>
+              </w:rPr>
+              <w:tab/>
+            </w:r>
+            <w:r>
+              <w:rPr>
+                <w:noProof/>
+                <w:webHidden/>
+              </w:rPr>
+              <w:fldChar w:fldCharType="begin"/>
+            </w:r>
+            <w:r>
+              <w:rPr>
+                <w:noProof/>
+                <w:webHidden/>
+              </w:rPr>
+              <w:instrText xml:space="preserve"> PAGEREF _Toc231032609 \h </w:instrText>
+            </w:r>
+            <w:r>
+              <w:rPr>
+                <w:noProof/>
+                <w:webHidden/>
+              </w:rPr>
+            </w:r>
+            <w:r>
+              <w:rPr>
+                <w:noProof/>
+                <w:webHidden/>
+              </w:rPr>
+              <w:fldChar w:fldCharType="separate"/>
+            </w:r>
+            <w:r>
+              <w:rPr>
+                <w:noProof/>
+                <w:webHidden/>
+              </w:rPr>
+              <w:t>1</w:t>
+            </w:r>
+            <w:r>
+              <w:rPr>
+                <w:noProof/>
+                <w:webHidden/>
+              </w:rPr>
+              <w:fldChar w:fldCharType="end"/>
+            </w:r>
+          </w:hyperlink>
+        </w:p>
+        <w:p>
+          <w:r>
+            <w:rPr>
+              <w:b/>
+              <w:bCs/>
+              <w:noProof/>
+            </w:rPr>
+            <w:fldChar w:fldCharType="end"/>
+          </w:r>
+        </w:p>
+      </w:sdtContent>
+    </w:sdt>
+    <w:p>
+      <w:pPr>
+        <w:rPr>
+          <w:color w:val="0B769F" w:themeColor="accent4" w:themeShade="BF"/>
+        </w:rPr>
+        <w:sectPr>
+          <w:headerReference w:type="first" r:id="rId11"/>
+          <w:pgSz w:w="11906" w:h="16838"/>
+          <w:pgMar w:top="1440" w:right="1440" w:bottom="1440" w:left="1440" w:header="708" w:footer="708" w:gutter="0"/>
+          <w:cols w:space="708"/>
+          <w:titlePg/>
+          <w:docGrid w:linePitch="360"/>
+        </w:sectPr>
+      </w:pPr>
+    </w:p>
+    <w:p>
+      <w:pPr>
+        <w:pStyle w:val="Heading1"/>
+      </w:pPr>
+      <w:bookmarkStart w:id="0" w:name="_Toc231032600"/>
+      <w:r>
+        <w:lastRenderedPageBreak/>
+        <w:t>Projektidee</w:t>
+      </w:r>
+      <w:bookmarkEnd w:id="0"/>
+    </w:p>
+    <w:p>
+      <w:pPr>
+        <w:spacing w:line="360" w:lineRule="auto"/>
+      </w:pPr>
+      <w:r>
+        <w:t>WordBank ist eine interaktive Wörterbuch-Applikation</w:t>
+      </w:r>
+      <w:r>
+        <w:t>, die Benutzer*innen ermöglicht Wörter zu erkundigen und diese zu favorisieren.</w:t>
+      </w:r>
+    </w:p>
+    <w:p>
+      <w:pPr>
+        <w:spacing w:line="360" w:lineRule="auto"/>
+      </w:pPr>
+      <w:r>
+        <w:t>Die App zeigt pro Klick ein zufälliges englisches Wort aus einer REST-API an. Nutzer*innen können wählen, ob sie zusätzlich Synonyme, Antonyme oder Beispielsätze angezeigt haben möchten.</w:t>
+      </w:r>
+      <w:r>
+        <w:t xml:space="preserve">  Für die einzelnen Wörter wird mindestens eine Definition angezeigt.</w:t>
+      </w:r>
+    </w:p>
+    <w:p>
+      <w:pPr>
+        <w:spacing w:line="360" w:lineRule="auto"/>
+      </w:pPr>
+      <w:r>
+        <w:t xml:space="preserve">Ihre Lieblingsdefinitionen können Nutzer*innen einfach auf der "Search"-Seite markieren und direkt mit einer Notiz versehen. </w:t>
+      </w:r>
+      <w:r>
+        <w:t xml:space="preserve"> Diese Favoriten können sie dann einfach auf der Favoriten-Seite bearbeiten.</w:t>
+      </w:r>
+    </w:p>
+    <w:p>
+      <w:pPr>
+        <w:spacing w:line="360" w:lineRule="auto"/>
+        <w:sectPr>
+          <w:headerReference w:type="first" r:id="rId12"/>
+          <w:footerReference w:type="first" r:id="rId13"/>
+          <w:pgSz w:w="11906" w:h="16838"/>
+          <w:pgMar w:top="1440" w:right="1440" w:bottom="1440" w:left="1440" w:header="708" w:footer="708" w:gutter="0"/>
+          <w:pgNumType w:start="1"/>
+          <w:cols w:space="708"/>
+          <w:titlePg/>
+          <w:docGrid w:linePitch="360"/>
+        </w:sectPr>
+      </w:pPr>
+      <w:r>
+        <w:t>Der Admin kann auf der Admin-Seite einfach neue Wörter hinzufügen oder bestehende Wörter löschen.</w:t>
+      </w:r>
+    </w:p>
+    <w:p>
+      <w:pPr>
+        <w:pStyle w:val="Heading1"/>
+      </w:pPr>
+      <w:bookmarkStart w:id="1" w:name="_Toc231032601"/>
+      <w:r>
+        <w:lastRenderedPageBreak/>
+        <w:t>Anforderungskatalog</w:t>
+      </w:r>
+      <w:bookmarkEnd w:id="1"/>
+    </w:p>
+    <w:p>
+      <w:pPr>
+        <w:pStyle w:val="Heading1"/>
+        <w:sectPr>
+          <w:pgSz w:w="11906" w:h="16838"/>
+          <w:pgMar w:top="1440" w:right="1440" w:bottom="1440" w:left="1440" w:header="708" w:footer="708" w:gutter="0"/>
+          <w:cols w:space="708"/>
+          <w:titlePg/>
+          <w:docGrid w:linePitch="360"/>
+        </w:sectPr>
+      </w:pPr>
+      <w:bookmarkStart w:id="2" w:name="_Toc231032602"/>
+    </w:p>
+    <w:p>
+      <w:pPr>
+        <w:pStyle w:val="Heading1"/>
+      </w:pPr>
+      <w:r>
+        <w:lastRenderedPageBreak/>
+        <w:t>Klassendiagramm</w:t>
+      </w:r>
+      <w:bookmarkEnd w:id="2"/>
+    </w:p>
+    <w:p>
+      <w:pPr>
+        <w:pStyle w:val="Heading1"/>
+        <w:sectPr>
+          <w:pgSz w:w="11906" w:h="16838"/>
+          <w:pgMar w:top="1440" w:right="1440" w:bottom="1440" w:left="1440" w:header="708" w:footer="708" w:gutter="0"/>
+          <w:cols w:space="708"/>
+          <w:titlePg/>
+          <w:docGrid w:linePitch="360"/>
+        </w:sectPr>
+      </w:pPr>
+      <w:bookmarkStart w:id="3" w:name="_Toc231032603"/>
+    </w:p>
+    <w:p>
+      <w:pPr>
+        <w:pStyle w:val="Heading1"/>
+      </w:pPr>
+      <w:r>
+        <w:lastRenderedPageBreak/>
+        <w:t>Storyboard</w:t>
+      </w:r>
+      <w:bookmarkEnd w:id="3"/>
+    </w:p>
+    <w:p>
+      <w:pPr>
+        <w:pStyle w:val="Heading1"/>
+        <w:sectPr>
+          <w:pgSz w:w="11906" w:h="16838"/>
+          <w:pgMar w:top="1440" w:right="1440" w:bottom="1440" w:left="1440" w:header="708" w:footer="708" w:gutter="0"/>
+          <w:cols w:space="708"/>
+          <w:titlePg/>
+          <w:docGrid w:linePitch="360"/>
+        </w:sectPr>
+      </w:pPr>
+      <w:bookmarkStart w:id="4" w:name="_Toc231032604"/>
+    </w:p>
+    <w:p>
+      <w:pPr>
+        <w:pStyle w:val="Heading1"/>
+      </w:pPr>
+      <w:r>
+        <w:lastRenderedPageBreak/>
+        <w:t>Screen-Mockups</w:t>
+      </w:r>
+      <w:bookmarkEnd w:id="4"/>
+    </w:p>
+    <w:p>
+      <w:pPr>
+        <w:pStyle w:val="Heading1"/>
+        <w:sectPr>
+          <w:pgSz w:w="11906" w:h="16838"/>
+          <w:pgMar w:top="1440" w:right="1440" w:bottom="1440" w:left="1440" w:header="708" w:footer="708" w:gutter="0"/>
+          <w:cols w:space="708"/>
+          <w:titlePg/>
+          <w:docGrid w:linePitch="360"/>
+        </w:sectPr>
+      </w:pPr>
+      <w:bookmarkStart w:id="5" w:name="_Toc231032605"/>
+    </w:p>
+    <w:p>
+      <w:pPr>
+        <w:pStyle w:val="Heading1"/>
+      </w:pPr>
+      <w:r>
+        <w:lastRenderedPageBreak/>
+        <w:t>REST-Schnittstellen</w:t>
+      </w:r>
+      <w:bookmarkEnd w:id="5"/>
+    </w:p>
+    <w:p>
+      <w:pPr>
+        <w:pStyle w:val="Heading1"/>
+        <w:sectPr>
+          <w:pgSz w:w="11906" w:h="16838"/>
+          <w:pgMar w:top="1440" w:right="1440" w:bottom="1440" w:left="1440" w:header="708" w:footer="708" w:gutter="0"/>
+          <w:cols w:space="708"/>
+          <w:titlePg/>
+          <w:docGrid w:linePitch="360"/>
+        </w:sectPr>
+      </w:pPr>
+      <w:bookmarkStart w:id="6" w:name="_Toc231032606"/>
+    </w:p>
+    <w:p>
+      <w:pPr>
+        <w:pStyle w:val="Heading1"/>
+      </w:pPr>
+      <w:r>
+        <w:lastRenderedPageBreak/>
+        <w:t>Testplan</w:t>
+      </w:r>
+      <w:bookmarkEnd w:id="6"/>
+    </w:p>
+    <w:p>
+      <w:pPr>
+        <w:pStyle w:val="Heading1"/>
+        <w:sectPr>
+          <w:pgSz w:w="11906" w:h="16838"/>
+          <w:pgMar w:top="1440" w:right="1440" w:bottom="1440" w:left="1440" w:header="708" w:footer="708" w:gutter="0"/>
+          <w:cols w:space="708"/>
+          <w:titlePg/>
+          <w:docGrid w:linePitch="360"/>
+        </w:sectPr>
+      </w:pPr>
+      <w:bookmarkStart w:id="7" w:name="_Toc231032607"/>
+    </w:p>
+    <w:p>
+      <w:pPr>
+        <w:pStyle w:val="Heading1"/>
+      </w:pPr>
+      <w:r>
+        <w:lastRenderedPageBreak/>
+        <w:t>Testergebnisse</w:t>
+      </w:r>
+      <w:bookmarkEnd w:id="7"/>
+    </w:p>
+    <w:p>
+      <w:pPr>
+        <w:pStyle w:val="Heading1"/>
+        <w:sectPr>
+          <w:pgSz w:w="11906" w:h="16838"/>
+          <w:pgMar w:top="1440" w:right="1440" w:bottom="1440" w:left="1440" w:header="708" w:footer="708" w:gutter="0"/>
+          <w:cols w:space="708"/>
+          <w:titlePg/>
+          <w:docGrid w:linePitch="360"/>
+        </w:sectPr>
+      </w:pPr>
+      <w:bookmarkStart w:id="8" w:name="_Toc231032608"/>
+    </w:p>
+    <w:p>
+      <w:pPr>
+        <w:pStyle w:val="Heading1"/>
+      </w:pPr>
+      <w:r>
+        <w:lastRenderedPageBreak/>
+        <w:t>Installationsanleitung</w:t>
+      </w:r>
+      <w:bookmarkEnd w:id="8"/>
+    </w:p>
+    <w:p>
+      <w:pPr>
+        <w:pStyle w:val="Heading1"/>
+        <w:sectPr>
+          <w:pgSz w:w="11906" w:h="16838"/>
+          <w:pgMar w:top="1440" w:right="1440" w:bottom="1440" w:left="1440" w:header="708" w:footer="708" w:gutter="0"/>
+          <w:cols w:space="708"/>
+          <w:titlePg/>
+          <w:docGrid w:linePitch="360"/>
+        </w:sectPr>
+      </w:pPr>
+      <w:bookmarkStart w:id="9" w:name="_Toc231032609"/>
+    </w:p>
+    <w:p>
+      <w:pPr>
+        <w:pStyle w:val="Heading1"/>
+      </w:pPr>
+      <w:r>
+        <w:lastRenderedPageBreak/>
+        <w:t>Hilfestellungen</w:t>
+      </w:r>
+      <w:bookmarkEnd w:id="9"/>
+    </w:p>
+    <w:p>
+      <w:hyperlink r:id="rId14" w:history="1">
         <w:r>
           <w:rPr>
             <w:rStyle w:val="Hyperlink"/>
           </w:rPr>
-          <w:t>https://www.w3schools.com/react/react_forms_checkbox.asp</w:t>
+          <w:t>https://www.w3schools.com</w:t>
         </w:r>
       </w:hyperlink>
     </w:p>
@@ -38,10 +1751,309 @@
       <w:pgSz w:w="11906" w:h="16838"/>
       <w:pgMar w:top="1440" w:right="1440" w:bottom="1440" w:left="1440" w:header="708" w:footer="708" w:gutter="0"/>
       <w:cols w:space="708"/>
+      <w:titlePg/>
       <w:docGrid w:linePitch="360"/>
     </w:sectPr>
   </w:body>
 </w:document>
+</file>
+
+<file path=word/endnotes.xml><?xml version="1.0" encoding="utf-8"?>
+<w:endnotes xmlns:wpc="http://schemas.microsoft.com/office/word/2010/wordprocessingCanvas" xmlns:cx="http://schemas.microsoft.com/office/drawing/2014/chartex" xmlns:cx1="http://schemas.microsoft.com/office/drawing/2015/9/8/chartex" xmlns:cx2="http://schemas.microsoft.com/office/drawing/2015/10/21/chartex" xmlns:cx3="http://schemas.microsoft.com/office/drawing/2016/5/9/chartex" xmlns:cx4="http://schemas.microsoft.com/office/drawing/2016/5/10/chartex" xmlns:cx5="http://schemas.microsoft.com/office/drawing/2016/5/11/chartex" xmlns:cx6="http://schemas.microsoft.com/office/drawing/2016/5/12/chartex" xmlns:cx7="http://schemas.microsoft.com/office/drawing/2016/5/13/chartex" xmlns:cx8="http://schemas.microsoft.com/office/drawing/2016/5/14/chartex" xmlns:mc="http://schemas.openxmlformats.org/markup-compatibility/2006" xmlns:aink="http://schemas.microsoft.com/office/drawing/2016/ink" xmlns:am3d="http://schemas.microsoft.com/office/drawing/2017/model3d" xmlns:o="urn:schemas-microsoft-com:office:office" xmlns:oel="http://schemas.microsoft.com/office/2019/extlst" xmlns:r="http://schemas.openxmlformats.org/officeDocument/2006/relationships" xmlns:m="http://schemas.openxmlformats.org/officeDocument/2006/math" xmlns:v="urn:schemas-microsoft-com:vml" xmlns:wp14="http://schemas.microsoft.com/office/word/2010/wordprocessingDrawing" xmlns:wp="http://schemas.openxmlformats.org/drawingml/2006/wordprocessingDrawing" xmlns:w10="urn:schemas-microsoft-com:office:word" xmlns:w="http://schemas.openxmlformats.org/wordprocessingml/2006/main" xmlns:w14="http://schemas.microsoft.com/office/word/2010/wordml" xmlns:w15="http://schemas.microsoft.com/office/word/2012/wordml" xmlns:w16cex="http://schemas.microsoft.com/office/word/2018/wordml/cex" xmlns:w16cid="http://schemas.microsoft.com/office/word/2016/wordml/cid" xmlns:w16="http://schemas.microsoft.com/office/word/2018/wordml" xmlns:w16du="http://schemas.microsoft.com/office/word/2023/wordml/word16du" xmlns:w16sdtdh="http://schemas.microsoft.com/office/word/2020/wordml/sdtdatahash" xmlns:w16sdtfl="http://schemas.microsoft.com/office/word/2024/wordml/sdtformatlock" xmlns:w16se="http://schemas.microsoft.com/office/word/2015/wordml/symex" xmlns:wpg="http://schemas.microsoft.com/office/word/2010/wordprocessingGroup" xmlns:wpi="http://schemas.microsoft.com/office/word/2010/wordprocessingInk" xmlns:wne="http://schemas.microsoft.com/office/word/2006/wordml" xmlns:wps="http://schemas.microsoft.com/office/word/2010/wordprocessingShape" mc:Ignorable="w14 w15 w16se w16cid w16 w16cex w16sdtdh w16sdtfl w16du wp14">
+  <w:endnote w:type="separator" w:id="-1">
+    <w:p>
+      <w:pPr>
+        <w:spacing w:after="0" w:line="240" w:lineRule="auto"/>
+      </w:pPr>
+      <w:r>
+        <w:separator/>
+      </w:r>
+    </w:p>
+  </w:endnote>
+  <w:endnote w:type="continuationSeparator" w:id="0">
+    <w:p>
+      <w:pPr>
+        <w:spacing w:after="0" w:line="240" w:lineRule="auto"/>
+      </w:pPr>
+      <w:r>
+        <w:continuationSeparator/>
+      </w:r>
+    </w:p>
+  </w:endnote>
+</w:endnotes>
+</file>
+
+<file path=word/footer1.xml><?xml version="1.0" encoding="utf-8"?>
+<w:ftr xmlns:wpc="http://schemas.microsoft.com/office/word/2010/wordprocessingCanvas" xmlns:cx="http://schemas.microsoft.com/office/drawing/2014/chartex" xmlns:cx1="http://schemas.microsoft.com/office/drawing/2015/9/8/chartex" xmlns:cx2="http://schemas.microsoft.com/office/drawing/2015/10/21/chartex" xmlns:cx3="http://schemas.microsoft.com/office/drawing/2016/5/9/chartex" xmlns:cx4="http://schemas.microsoft.com/office/drawing/2016/5/10/chartex" xmlns:cx5="http://schemas.microsoft.com/office/drawing/2016/5/11/chartex" xmlns:cx6="http://schemas.microsoft.com/office/drawing/2016/5/12/chartex" xmlns:cx7="http://schemas.microsoft.com/office/drawing/2016/5/13/chartex" xmlns:cx8="http://schemas.microsoft.com/office/drawing/2016/5/14/chartex" xmlns:mc="http://schemas.openxmlformats.org/markup-compatibility/2006" xmlns:aink="http://schemas.microsoft.com/office/drawing/2016/ink" xmlns:am3d="http://schemas.microsoft.com/office/drawing/2017/model3d" xmlns:o="urn:schemas-microsoft-com:office:office" xmlns:oel="http://schemas.microsoft.com/office/2019/extlst" xmlns:r="http://schemas.openxmlformats.org/officeDocument/2006/relationships" xmlns:m="http://schemas.openxmlformats.org/officeDocument/2006/math" xmlns:v="urn:schemas-microsoft-com:vml" xmlns:wp14="http://schemas.microsoft.com/office/word/2010/wordprocessingDrawing" xmlns:wp="http://schemas.openxmlformats.org/drawingml/2006/wordprocessingDrawing" xmlns:w10="urn:schemas-microsoft-com:office:word" xmlns:w="http://schemas.openxmlformats.org/wordprocessingml/2006/main" xmlns:w14="http://schemas.microsoft.com/office/word/2010/wordml" xmlns:w15="http://schemas.microsoft.com/office/word/2012/wordml" xmlns:w16cex="http://schemas.microsoft.com/office/word/2018/wordml/cex" xmlns:w16cid="http://schemas.microsoft.com/office/word/2016/wordml/cid" xmlns:w16="http://schemas.microsoft.com/office/word/2018/wordml" xmlns:w16du="http://schemas.microsoft.com/office/word/2023/wordml/word16du" xmlns:w16sdtdh="http://schemas.microsoft.com/office/word/2020/wordml/sdtdatahash" xmlns:w16sdtfl="http://schemas.microsoft.com/office/word/2024/wordml/sdtformatlock" xmlns:w16se="http://schemas.microsoft.com/office/word/2015/wordml/symex" xmlns:wpg="http://schemas.microsoft.com/office/word/2010/wordprocessingGroup" xmlns:wpi="http://schemas.microsoft.com/office/word/2010/wordprocessingInk" xmlns:wne="http://schemas.microsoft.com/office/word/2006/wordml" xmlns:wps="http://schemas.microsoft.com/office/word/2010/wordprocessingShape" mc:Ignorable="w14 w15 w16se w16cid w16 w16cex w16sdtdh w16sdtfl w16du wp14">
+  <w:sdt>
+    <w:sdtPr>
+      <w:id w:val="-1171715662"/>
+      <w:docPartObj>
+        <w:docPartGallery w:val="Page Numbers (Bottom of Page)"/>
+        <w:docPartUnique/>
+      </w:docPartObj>
+    </w:sdtPr>
+    <w:sdtEndPr>
+      <w:rPr>
+        <w:noProof/>
+      </w:rPr>
+    </w:sdtEndPr>
+    <w:sdtContent>
+      <w:p>
+        <w:pPr>
+          <w:pStyle w:val="Footer"/>
+          <w:jc w:val="right"/>
+        </w:pPr>
+        <w:r>
+          <w:fldChar w:fldCharType="begin"/>
+        </w:r>
+        <w:r>
+          <w:instrText xml:space="preserve"> PAGE   \* MERGEFORMAT </w:instrText>
+        </w:r>
+        <w:r>
+          <w:fldChar w:fldCharType="separate"/>
+        </w:r>
+        <w:r>
+          <w:rPr>
+            <w:noProof/>
+          </w:rPr>
+          <w:t>2</w:t>
+        </w:r>
+        <w:r>
+          <w:rPr>
+            <w:noProof/>
+          </w:rPr>
+          <w:fldChar w:fldCharType="end"/>
+        </w:r>
+      </w:p>
+    </w:sdtContent>
+  </w:sdt>
+  <w:p>
+    <w:pPr>
+      <w:pStyle w:val="Footer"/>
+    </w:pPr>
+  </w:p>
+</w:ftr>
+</file>
+
+<file path=word/footer2.xml><?xml version="1.0" encoding="utf-8"?>
+<w:ftr xmlns:wpc="http://schemas.microsoft.com/office/word/2010/wordprocessingCanvas" xmlns:cx="http://schemas.microsoft.com/office/drawing/2014/chartex" xmlns:cx1="http://schemas.microsoft.com/office/drawing/2015/9/8/chartex" xmlns:cx2="http://schemas.microsoft.com/office/drawing/2015/10/21/chartex" xmlns:cx3="http://schemas.microsoft.com/office/drawing/2016/5/9/chartex" xmlns:cx4="http://schemas.microsoft.com/office/drawing/2016/5/10/chartex" xmlns:cx5="http://schemas.microsoft.com/office/drawing/2016/5/11/chartex" xmlns:cx6="http://schemas.microsoft.com/office/drawing/2016/5/12/chartex" xmlns:cx7="http://schemas.microsoft.com/office/drawing/2016/5/13/chartex" xmlns:cx8="http://schemas.microsoft.com/office/drawing/2016/5/14/chartex" xmlns:mc="http://schemas.openxmlformats.org/markup-compatibility/2006" xmlns:aink="http://schemas.microsoft.com/office/drawing/2016/ink" xmlns:am3d="http://schemas.microsoft.com/office/drawing/2017/model3d" xmlns:o="urn:schemas-microsoft-com:office:office" xmlns:oel="http://schemas.microsoft.com/office/2019/extlst" xmlns:r="http://schemas.openxmlformats.org/officeDocument/2006/relationships" xmlns:m="http://schemas.openxmlformats.org/officeDocument/2006/math" xmlns:v="urn:schemas-microsoft-com:vml" xmlns:wp14="http://schemas.microsoft.com/office/word/2010/wordprocessingDrawing" xmlns:wp="http://schemas.openxmlformats.org/drawingml/2006/wordprocessingDrawing" xmlns:w10="urn:schemas-microsoft-com:office:word" xmlns:w="http://schemas.openxmlformats.org/wordprocessingml/2006/main" xmlns:w14="http://schemas.microsoft.com/office/word/2010/wordml" xmlns:w15="http://schemas.microsoft.com/office/word/2012/wordml" xmlns:w16cex="http://schemas.microsoft.com/office/word/2018/wordml/cex" xmlns:w16cid="http://schemas.microsoft.com/office/word/2016/wordml/cid" xmlns:w16="http://schemas.microsoft.com/office/word/2018/wordml" xmlns:w16du="http://schemas.microsoft.com/office/word/2023/wordml/word16du" xmlns:w16sdtdh="http://schemas.microsoft.com/office/word/2020/wordml/sdtdatahash" xmlns:w16sdtfl="http://schemas.microsoft.com/office/word/2024/wordml/sdtformatlock" xmlns:w16se="http://schemas.microsoft.com/office/word/2015/wordml/symex" xmlns:wpg="http://schemas.microsoft.com/office/word/2010/wordprocessingGroup" xmlns:wpi="http://schemas.microsoft.com/office/word/2010/wordprocessingInk" xmlns:wne="http://schemas.microsoft.com/office/word/2006/wordml" xmlns:wps="http://schemas.microsoft.com/office/word/2010/wordprocessingShape" mc:Ignorable="w14 w15 w16se w16cid w16 w16cex w16sdtdh w16sdtfl w16du wp14">
+  <w:p>
+    <w:pPr>
+      <w:pStyle w:val="Footer"/>
+    </w:pPr>
+  </w:p>
+  <w:p>
+    <w:pPr>
+      <w:pStyle w:val="Footer"/>
+    </w:pPr>
+  </w:p>
+</w:ftr>
+</file>
+
+<file path=word/footer3.xml><?xml version="1.0" encoding="utf-8"?>
+<w:ftr xmlns:wpc="http://schemas.microsoft.com/office/word/2010/wordprocessingCanvas" xmlns:cx="http://schemas.microsoft.com/office/drawing/2014/chartex" xmlns:cx1="http://schemas.microsoft.com/office/drawing/2015/9/8/chartex" xmlns:cx2="http://schemas.microsoft.com/office/drawing/2015/10/21/chartex" xmlns:cx3="http://schemas.microsoft.com/office/drawing/2016/5/9/chartex" xmlns:cx4="http://schemas.microsoft.com/office/drawing/2016/5/10/chartex" xmlns:cx5="http://schemas.microsoft.com/office/drawing/2016/5/11/chartex" xmlns:cx6="http://schemas.microsoft.com/office/drawing/2016/5/12/chartex" xmlns:cx7="http://schemas.microsoft.com/office/drawing/2016/5/13/chartex" xmlns:cx8="http://schemas.microsoft.com/office/drawing/2016/5/14/chartex" xmlns:mc="http://schemas.openxmlformats.org/markup-compatibility/2006" xmlns:aink="http://schemas.microsoft.com/office/drawing/2016/ink" xmlns:am3d="http://schemas.microsoft.com/office/drawing/2017/model3d" xmlns:o="urn:schemas-microsoft-com:office:office" xmlns:oel="http://schemas.microsoft.com/office/2019/extlst" xmlns:r="http://schemas.openxmlformats.org/officeDocument/2006/relationships" xmlns:m="http://schemas.openxmlformats.org/officeDocument/2006/math" xmlns:v="urn:schemas-microsoft-com:vml" xmlns:wp14="http://schemas.microsoft.com/office/word/2010/wordprocessingDrawing" xmlns:wp="http://schemas.openxmlformats.org/drawingml/2006/wordprocessingDrawing" xmlns:w10="urn:schemas-microsoft-com:office:word" xmlns:w="http://schemas.openxmlformats.org/wordprocessingml/2006/main" xmlns:w14="http://schemas.microsoft.com/office/word/2010/wordml" xmlns:w15="http://schemas.microsoft.com/office/word/2012/wordml" xmlns:w16cex="http://schemas.microsoft.com/office/word/2018/wordml/cex" xmlns:w16cid="http://schemas.microsoft.com/office/word/2016/wordml/cid" xmlns:w16="http://schemas.microsoft.com/office/word/2018/wordml" xmlns:w16du="http://schemas.microsoft.com/office/word/2023/wordml/word16du" xmlns:w16sdtdh="http://schemas.microsoft.com/office/word/2020/wordml/sdtdatahash" xmlns:w16sdtfl="http://schemas.microsoft.com/office/word/2024/wordml/sdtformatlock" xmlns:w16se="http://schemas.microsoft.com/office/word/2015/wordml/symex" xmlns:wpg="http://schemas.microsoft.com/office/word/2010/wordprocessingGroup" xmlns:wpi="http://schemas.microsoft.com/office/word/2010/wordprocessingInk" xmlns:wne="http://schemas.microsoft.com/office/word/2006/wordml" xmlns:wps="http://schemas.microsoft.com/office/word/2010/wordprocessingShape" mc:Ignorable="w14 w15 w16se w16cid w16 w16cex w16sdtdh w16sdtfl w16du wp14">
+  <w:sdt>
+    <w:sdtPr>
+      <w:id w:val="-63184500"/>
+      <w:docPartObj>
+        <w:docPartGallery w:val="Page Numbers (Bottom of Page)"/>
+        <w:docPartUnique/>
+      </w:docPartObj>
+    </w:sdtPr>
+    <w:sdtEndPr>
+      <w:rPr>
+        <w:noProof/>
+      </w:rPr>
+    </w:sdtEndPr>
+    <w:sdtContent>
+      <w:p>
+        <w:pPr>
+          <w:pStyle w:val="Footer"/>
+          <w:jc w:val="right"/>
+        </w:pPr>
+        <w:r>
+          <w:fldChar w:fldCharType="begin"/>
+        </w:r>
+        <w:r>
+          <w:instrText xml:space="preserve"> PAGE   \* MERGEFORMAT </w:instrText>
+        </w:r>
+        <w:r>
+          <w:fldChar w:fldCharType="separate"/>
+        </w:r>
+        <w:r>
+          <w:rPr>
+            <w:noProof/>
+          </w:rPr>
+          <w:t>2</w:t>
+        </w:r>
+        <w:r>
+          <w:rPr>
+            <w:noProof/>
+          </w:rPr>
+          <w:fldChar w:fldCharType="end"/>
+        </w:r>
+      </w:p>
+    </w:sdtContent>
+  </w:sdt>
+  <w:p>
+    <w:pPr>
+      <w:pStyle w:val="Footer"/>
+    </w:pPr>
+  </w:p>
+</w:ftr>
+</file>
+
+<file path=word/footnotes.xml><?xml version="1.0" encoding="utf-8"?>
+<w:footnotes xmlns:wpc="http://schemas.microsoft.com/office/word/2010/wordprocessingCanvas" xmlns:cx="http://schemas.microsoft.com/office/drawing/2014/chartex" xmlns:cx1="http://schemas.microsoft.com/office/drawing/2015/9/8/chartex" xmlns:cx2="http://schemas.microsoft.com/office/drawing/2015/10/21/chartex" xmlns:cx3="http://schemas.microsoft.com/office/drawing/2016/5/9/chartex" xmlns:cx4="http://schemas.microsoft.com/office/drawing/2016/5/10/chartex" xmlns:cx5="http://schemas.microsoft.com/office/drawing/2016/5/11/chartex" xmlns:cx6="http://schemas.microsoft.com/office/drawing/2016/5/12/chartex" xmlns:cx7="http://schemas.microsoft.com/office/drawing/2016/5/13/chartex" xmlns:cx8="http://schemas.microsoft.com/office/drawing/2016/5/14/chartex" xmlns:mc="http://schemas.openxmlformats.org/markup-compatibility/2006" xmlns:aink="http://schemas.microsoft.com/office/drawing/2016/ink" xmlns:am3d="http://schemas.microsoft.com/office/drawing/2017/model3d" xmlns:o="urn:schemas-microsoft-com:office:office" xmlns:oel="http://schemas.microsoft.com/office/2019/extlst" xmlns:r="http://schemas.openxmlformats.org/officeDocument/2006/relationships" xmlns:m="http://schemas.openxmlformats.org/officeDocument/2006/math" xmlns:v="urn:schemas-microsoft-com:vml" xmlns:wp14="http://schemas.microsoft.com/office/word/2010/wordprocessingDrawing" xmlns:wp="http://schemas.openxmlformats.org/drawingml/2006/wordprocessingDrawing" xmlns:w10="urn:schemas-microsoft-com:office:word" xmlns:w="http://schemas.openxmlformats.org/wordprocessingml/2006/main" xmlns:w14="http://schemas.microsoft.com/office/word/2010/wordml" xmlns:w15="http://schemas.microsoft.com/office/word/2012/wordml" xmlns:w16cex="http://schemas.microsoft.com/office/word/2018/wordml/cex" xmlns:w16cid="http://schemas.microsoft.com/office/word/2016/wordml/cid" xmlns:w16="http://schemas.microsoft.com/office/word/2018/wordml" xmlns:w16du="http://schemas.microsoft.com/office/word/2023/wordml/word16du" xmlns:w16sdtdh="http://schemas.microsoft.com/office/word/2020/wordml/sdtdatahash" xmlns:w16sdtfl="http://schemas.microsoft.com/office/word/2024/wordml/sdtformatlock" xmlns:w16se="http://schemas.microsoft.com/office/word/2015/wordml/symex" xmlns:wpg="http://schemas.microsoft.com/office/word/2010/wordprocessingGroup" xmlns:wpi="http://schemas.microsoft.com/office/word/2010/wordprocessingInk" xmlns:wne="http://schemas.microsoft.com/office/word/2006/wordml" xmlns:wps="http://schemas.microsoft.com/office/word/2010/wordprocessingShape" mc:Ignorable="w14 w15 w16se w16cid w16 w16cex w16sdtdh w16sdtfl w16du wp14">
+  <w:footnote w:type="separator" w:id="-1">
+    <w:p>
+      <w:pPr>
+        <w:spacing w:after="0" w:line="240" w:lineRule="auto"/>
+      </w:pPr>
+      <w:r>
+        <w:separator/>
+      </w:r>
+    </w:p>
+  </w:footnote>
+  <w:footnote w:type="continuationSeparator" w:id="0">
+    <w:p>
+      <w:pPr>
+        <w:spacing w:after="0" w:line="240" w:lineRule="auto"/>
+      </w:pPr>
+      <w:r>
+        <w:continuationSeparator/>
+      </w:r>
+    </w:p>
+  </w:footnote>
+</w:footnotes>
+</file>
+
+<file path=word/header1.xml><?xml version="1.0" encoding="utf-8"?>
+<w:hdr xmlns:wpc="http://schemas.microsoft.com/office/word/2010/wordprocessingCanvas" xmlns:cx="http://schemas.microsoft.com/office/drawing/2014/chartex" xmlns:cx1="http://schemas.microsoft.com/office/drawing/2015/9/8/chartex" xmlns:cx2="http://schemas.microsoft.com/office/drawing/2015/10/21/chartex" xmlns:cx3="http://schemas.microsoft.com/office/drawing/2016/5/9/chartex" xmlns:cx4="http://schemas.microsoft.com/office/drawing/2016/5/10/chartex" xmlns:cx5="http://schemas.microsoft.com/office/drawing/2016/5/11/chartex" xmlns:cx6="http://schemas.microsoft.com/office/drawing/2016/5/12/chartex" xmlns:cx7="http://schemas.microsoft.com/office/drawing/2016/5/13/chartex" xmlns:cx8="http://schemas.microsoft.com/office/drawing/2016/5/14/chartex" xmlns:mc="http://schemas.openxmlformats.org/markup-compatibility/2006" xmlns:aink="http://schemas.microsoft.com/office/drawing/2016/ink" xmlns:am3d="http://schemas.microsoft.com/office/drawing/2017/model3d" xmlns:o="urn:schemas-microsoft-com:office:office" xmlns:oel="http://schemas.microsoft.com/office/2019/extlst" xmlns:r="http://schemas.openxmlformats.org/officeDocument/2006/relationships" xmlns:m="http://schemas.openxmlformats.org/officeDocument/2006/math" xmlns:v="urn:schemas-microsoft-com:vml" xmlns:wp14="http://schemas.microsoft.com/office/word/2010/wordprocessingDrawing" xmlns:wp="http://schemas.openxmlformats.org/drawingml/2006/wordprocessingDrawing" xmlns:w10="urn:schemas-microsoft-com:office:word" xmlns:w="http://schemas.openxmlformats.org/wordprocessingml/2006/main" xmlns:w14="http://schemas.microsoft.com/office/word/2010/wordml" xmlns:w15="http://schemas.microsoft.com/office/word/2012/wordml" xmlns:w16cex="http://schemas.microsoft.com/office/word/2018/wordml/cex" xmlns:w16cid="http://schemas.microsoft.com/office/word/2016/wordml/cid" xmlns:w16="http://schemas.microsoft.com/office/word/2018/wordml" xmlns:w16du="http://schemas.microsoft.com/office/word/2023/wordml/word16du" xmlns:w16sdtdh="http://schemas.microsoft.com/office/word/2020/wordml/sdtdatahash" xmlns:w16sdtfl="http://schemas.microsoft.com/office/word/2024/wordml/sdtformatlock" xmlns:w16se="http://schemas.microsoft.com/office/word/2015/wordml/symex" xmlns:wpg="http://schemas.microsoft.com/office/word/2010/wordprocessingGroup" xmlns:wpi="http://schemas.microsoft.com/office/word/2010/wordprocessingInk" xmlns:wne="http://schemas.microsoft.com/office/word/2006/wordml" xmlns:wps="http://schemas.microsoft.com/office/word/2010/wordprocessingShape" mc:Ignorable="w14 w15 w16se w16cid w16 w16cex w16sdtdh w16sdtfl w16du wp14">
+  <w:p>
+    <w:pPr>
+      <w:pStyle w:val="Header"/>
+    </w:pPr>
+  </w:p>
+</w:hdr>
+</file>
+
+<file path=word/header2.xml><?xml version="1.0" encoding="utf-8"?>
+<w:hdr xmlns:wpc="http://schemas.microsoft.com/office/word/2010/wordprocessingCanvas" xmlns:cx="http://schemas.microsoft.com/office/drawing/2014/chartex" xmlns:cx1="http://schemas.microsoft.com/office/drawing/2015/9/8/chartex" xmlns:cx2="http://schemas.microsoft.com/office/drawing/2015/10/21/chartex" xmlns:cx3="http://schemas.microsoft.com/office/drawing/2016/5/9/chartex" xmlns:cx4="http://schemas.microsoft.com/office/drawing/2016/5/10/chartex" xmlns:cx5="http://schemas.microsoft.com/office/drawing/2016/5/11/chartex" xmlns:cx6="http://schemas.microsoft.com/office/drawing/2016/5/12/chartex" xmlns:cx7="http://schemas.microsoft.com/office/drawing/2016/5/13/chartex" xmlns:cx8="http://schemas.microsoft.com/office/drawing/2016/5/14/chartex" xmlns:mc="http://schemas.openxmlformats.org/markup-compatibility/2006" xmlns:aink="http://schemas.microsoft.com/office/drawing/2016/ink" xmlns:am3d="http://schemas.microsoft.com/office/drawing/2017/model3d" xmlns:o="urn:schemas-microsoft-com:office:office" xmlns:oel="http://schemas.microsoft.com/office/2019/extlst" xmlns:r="http://schemas.openxmlformats.org/officeDocument/2006/relationships" xmlns:m="http://schemas.openxmlformats.org/officeDocument/2006/math" xmlns:v="urn:schemas-microsoft-com:vml" xmlns:wp14="http://schemas.microsoft.com/office/word/2010/wordprocessingDrawing" xmlns:wp="http://schemas.openxmlformats.org/drawingml/2006/wordprocessingDrawing" xmlns:w10="urn:schemas-microsoft-com:office:word" xmlns:w="http://schemas.openxmlformats.org/wordprocessingml/2006/main" xmlns:w14="http://schemas.microsoft.com/office/word/2010/wordml" xmlns:w15="http://schemas.microsoft.com/office/word/2012/wordml" xmlns:w16cex="http://schemas.microsoft.com/office/word/2018/wordml/cex" xmlns:w16cid="http://schemas.microsoft.com/office/word/2016/wordml/cid" xmlns:w16="http://schemas.microsoft.com/office/word/2018/wordml" xmlns:w16du="http://schemas.microsoft.com/office/word/2023/wordml/word16du" xmlns:w16sdtdh="http://schemas.microsoft.com/office/word/2020/wordml/sdtdatahash" xmlns:w16sdtfl="http://schemas.microsoft.com/office/word/2024/wordml/sdtformatlock" xmlns:w16se="http://schemas.microsoft.com/office/word/2015/wordml/symex" xmlns:wpg="http://schemas.microsoft.com/office/word/2010/wordprocessingGroup" xmlns:wpi="http://schemas.microsoft.com/office/word/2010/wordprocessingInk" xmlns:wne="http://schemas.microsoft.com/office/word/2006/wordml" xmlns:wps="http://schemas.microsoft.com/office/word/2010/wordprocessingShape" mc:Ignorable="w14 w15 w16se w16cid w16 w16cex w16sdtdh w16sdtfl w16du wp14">
+  <w:p>
+    <w:pPr>
+      <w:pStyle w:val="Header"/>
+    </w:pPr>
+    <w:r>
+      <w:t>WordBank-Projektdokumentation</w:t>
+    </w:r>
+    <w:r>
+      <w:tab/>
+    </w:r>
+    <w:r>
+      <w:tab/>
+      <w:t>Florina Osmani</w:t>
+    </w:r>
+  </w:p>
+</w:hdr>
+</file>
+
+<file path=word/numbering.xml><?xml version="1.0" encoding="utf-8"?>
+<w:numbering xmlns:wpc="http://schemas.microsoft.com/office/word/2010/wordprocessingCanvas" xmlns:cx="http://schemas.microsoft.com/office/drawing/2014/chartex" xmlns:cx1="http://schemas.microsoft.com/office/drawing/2015/9/8/chartex" xmlns:cx2="http://schemas.microsoft.com/office/drawing/2015/10/21/chartex" xmlns:cx3="http://schemas.microsoft.com/office/drawing/2016/5/9/chartex" xmlns:cx4="http://schemas.microsoft.com/office/drawing/2016/5/10/chartex" xmlns:cx5="http://schemas.microsoft.com/office/drawing/2016/5/11/chartex" xmlns:cx6="http://schemas.microsoft.com/office/drawing/2016/5/12/chartex" xmlns:cx7="http://schemas.microsoft.com/office/drawing/2016/5/13/chartex" xmlns:cx8="http://schemas.microsoft.com/office/drawing/2016/5/14/chartex" xmlns:mc="http://schemas.openxmlformats.org/markup-compatibility/2006" xmlns:aink="http://schemas.microsoft.com/office/drawing/2016/ink" xmlns:am3d="http://schemas.microsoft.com/office/drawing/2017/model3d" xmlns:o="urn:schemas-microsoft-com:office:office" xmlns:oel="http://schemas.microsoft.com/office/2019/extlst" xmlns:r="http://schemas.openxmlformats.org/officeDocument/2006/relationships" xmlns:m="http://schemas.openxmlformats.org/officeDocument/2006/math" xmlns:v="urn:schemas-microsoft-com:vml" xmlns:wp14="http://schemas.microsoft.com/office/word/2010/wordprocessingDrawing" xmlns:wp="http://schemas.openxmlformats.org/drawingml/2006/wordprocessingDrawing" xmlns:w10="urn:schemas-microsoft-com:office:word" xmlns:w="http://schemas.openxmlformats.org/wordprocessingml/2006/main" xmlns:w14="http://schemas.microsoft.com/office/word/2010/wordml" xmlns:w15="http://schemas.microsoft.com/office/word/2012/wordml" xmlns:w16cex="http://schemas.microsoft.com/office/word/2018/wordml/cex" xmlns:w16cid="http://schemas.microsoft.com/office/word/2016/wordml/cid" xmlns:w16="http://schemas.microsoft.com/office/word/2018/wordml" xmlns:w16du="http://schemas.microsoft.com/office/word/2023/wordml/word16du" xmlns:w16sdtdh="http://schemas.microsoft.com/office/word/2020/wordml/sdtdatahash" xmlns:w16sdtfl="http://schemas.microsoft.com/office/word/2024/wordml/sdtformatlock" xmlns:w16se="http://schemas.microsoft.com/office/word/2015/wordml/symex" xmlns:wpg="http://schemas.microsoft.com/office/word/2010/wordprocessingGroup" xmlns:wpi="http://schemas.microsoft.com/office/word/2010/wordprocessingInk" xmlns:wne="http://schemas.microsoft.com/office/word/2006/wordml" xmlns:wps="http://schemas.microsoft.com/office/word/2010/wordprocessingShape" mc:Ignorable="w14 w15 w16se w16cid w16 w16cex w16sdtdh w16sdtfl w16du wp14">
+  <w:abstractNum w:abstractNumId="0" w15:restartNumberingAfterBreak="0">
+    <w:nsid w:val="4B8E504B"/>
+    <w:multiLevelType w:val="hybridMultilevel"/>
+    <w:tmpl w:val="8E3AE292"/>
+    <w:lvl w:ilvl="0" w:tplc="0807000F">
+      <w:start w:val="1"/>
+      <w:numFmt w:val="decimal"/>
+      <w:lvlText w:val="%1."/>
+      <w:lvlJc w:val="left"/>
+      <w:pPr>
+        <w:ind w:left="720" w:hanging="360"/>
+      </w:pPr>
+      <w:rPr>
+        <w:rFonts w:hint="default"/>
+      </w:rPr>
+    </w:lvl>
+    <w:lvl w:ilvl="1" w:tplc="08070019" w:tentative="1">
+      <w:start w:val="1"/>
+      <w:numFmt w:val="lowerLetter"/>
+      <w:lvlText w:val="%2."/>
+      <w:lvlJc w:val="left"/>
+      <w:pPr>
+        <w:ind w:left="1440" w:hanging="360"/>
+      </w:pPr>
+    </w:lvl>
+    <w:lvl w:ilvl="2" w:tplc="0807001B" w:tentative="1">
+      <w:start w:val="1"/>
+      <w:numFmt w:val="lowerRoman"/>
+      <w:lvlText w:val="%3."/>
+      <w:lvlJc w:val="right"/>
+      <w:pPr>
+        <w:ind w:left="2160" w:hanging="180"/>
+      </w:pPr>
+    </w:lvl>
+    <w:lvl w:ilvl="3" w:tplc="0807000F" w:tentative="1">
+      <w:start w:val="1"/>
+      <w:numFmt w:val="decimal"/>
+      <w:lvlText w:val="%4."/>
+      <w:lvlJc w:val="left"/>
+      <w:pPr>
+        <w:ind w:left="2880" w:hanging="360"/>
+      </w:pPr>
+    </w:lvl>
+    <w:lvl w:ilvl="4" w:tplc="08070019" w:tentative="1">
+      <w:start w:val="1"/>
+      <w:numFmt w:val="lowerLetter"/>
+      <w:lvlText w:val="%5."/>
+      <w:lvlJc w:val="left"/>
+      <w:pPr>
+        <w:ind w:left="3600" w:hanging="360"/>
+      </w:pPr>
+    </w:lvl>
+    <w:lvl w:ilvl="5" w:tplc="0807001B" w:tentative="1">
+      <w:start w:val="1"/>
+      <w:numFmt w:val="lowerRoman"/>
+      <w:lvlText w:val="%6."/>
+      <w:lvlJc w:val="right"/>
+      <w:pPr>
+        <w:ind w:left="4320" w:hanging="180"/>
+      </w:pPr>
+    </w:lvl>
+    <w:lvl w:ilvl="6" w:tplc="0807000F" w:tentative="1">
+      <w:start w:val="1"/>
+      <w:numFmt w:val="decimal"/>
+      <w:lvlText w:val="%7."/>
+      <w:lvlJc w:val="left"/>
+      <w:pPr>
+        <w:ind w:left="5040" w:hanging="360"/>
+      </w:pPr>
+    </w:lvl>
+    <w:lvl w:ilvl="7" w:tplc="08070019" w:tentative="1">
+      <w:start w:val="1"/>
+      <w:numFmt w:val="lowerLetter"/>
+      <w:lvlText w:val="%8."/>
+      <w:lvlJc w:val="left"/>
+      <w:pPr>
+        <w:ind w:left="5760" w:hanging="360"/>
+      </w:pPr>
+    </w:lvl>
+    <w:lvl w:ilvl="8" w:tplc="0807001B" w:tentative="1">
+      <w:start w:val="1"/>
+      <w:numFmt w:val="lowerRoman"/>
+      <w:lvlText w:val="%9."/>
+      <w:lvlJc w:val="right"/>
+      <w:pPr>
+        <w:ind w:left="6480" w:hanging="180"/>
+      </w:pPr>
+    </w:lvl>
+  </w:abstractNum>
+  <w:num w:numId="1" w16cid:durableId="581918073">
+    <w:abstractNumId w:val="0"/>
+  </w:num>
+</w:numbering>
 </file>
 
 <file path=word/styles.xml><?xml version="1.0" encoding="utf-8"?>
@@ -473,7 +2485,6 @@
     <w:next w:val="Normal"/>
     <w:link w:val="Heading2Char"/>
     <w:uiPriority w:val="9"/>
-    <w:semiHidden/>
     <w:unhideWhenUsed/>
     <w:qFormat/>
     <w:rsid w:val="00767193"/>
@@ -690,7 +2701,6 @@
     <w:basedOn w:val="DefaultParagraphFont"/>
     <w:link w:val="Heading2"/>
     <w:uiPriority w:val="9"/>
-    <w:semiHidden/>
     <w:rsid w:val="00767193"/>
     <w:rPr>
       <w:rFonts w:asciiTheme="majorHAnsi" w:eastAsiaTheme="majorEastAsia" w:hAnsiTheme="majorHAnsi" w:cstheme="majorBidi"/>
@@ -983,6 +2993,92 @@
     <w:rPr>
       <w:color w:val="605E5C"/>
       <w:shd w:val="clear" w:color="auto" w:fill="E1DFDD"/>
+    </w:rPr>
+  </w:style>
+  <w:style w:type="paragraph" w:styleId="Header">
+    <w:name w:val="header"/>
+    <w:basedOn w:val="Normal"/>
+    <w:link w:val="HeaderChar"/>
+    <w:uiPriority w:val="99"/>
+    <w:unhideWhenUsed/>
+    <w:rsid w:val="0032515B"/>
+    <w:pPr>
+      <w:tabs>
+        <w:tab w:val="center" w:pos="4513"/>
+        <w:tab w:val="right" w:pos="9026"/>
+      </w:tabs>
+      <w:spacing w:after="0" w:line="240" w:lineRule="auto"/>
+    </w:pPr>
+  </w:style>
+  <w:style w:type="character" w:customStyle="1" w:styleId="HeaderChar">
+    <w:name w:val="Header Char"/>
+    <w:basedOn w:val="DefaultParagraphFont"/>
+    <w:link w:val="Header"/>
+    <w:uiPriority w:val="99"/>
+    <w:rsid w:val="0032515B"/>
+  </w:style>
+  <w:style w:type="paragraph" w:styleId="Footer">
+    <w:name w:val="footer"/>
+    <w:basedOn w:val="Normal"/>
+    <w:link w:val="FooterChar"/>
+    <w:uiPriority w:val="99"/>
+    <w:unhideWhenUsed/>
+    <w:rsid w:val="0032515B"/>
+    <w:pPr>
+      <w:tabs>
+        <w:tab w:val="center" w:pos="4513"/>
+        <w:tab w:val="right" w:pos="9026"/>
+      </w:tabs>
+      <w:spacing w:after="0" w:line="240" w:lineRule="auto"/>
+    </w:pPr>
+  </w:style>
+  <w:style w:type="character" w:customStyle="1" w:styleId="FooterChar">
+    <w:name w:val="Footer Char"/>
+    <w:basedOn w:val="DefaultParagraphFont"/>
+    <w:link w:val="Footer"/>
+    <w:uiPriority w:val="99"/>
+    <w:rsid w:val="0032515B"/>
+  </w:style>
+  <w:style w:type="paragraph" w:styleId="TOCHeading">
+    <w:name w:val="TOC Heading"/>
+    <w:basedOn w:val="Heading1"/>
+    <w:next w:val="Normal"/>
+    <w:uiPriority w:val="39"/>
+    <w:unhideWhenUsed/>
+    <w:qFormat/>
+    <w:rsid w:val="00550931"/>
+    <w:pPr>
+      <w:spacing w:before="240" w:after="0" w:line="259" w:lineRule="auto"/>
+      <w:outlineLvl w:val="9"/>
+    </w:pPr>
+    <w:rPr>
+      <w:kern w:val="0"/>
+      <w:sz w:val="32"/>
+      <w:szCs w:val="32"/>
+      <w:lang w:val="en-US"/>
+      <w14:ligatures w14:val="none"/>
+    </w:rPr>
+  </w:style>
+  <w:style w:type="paragraph" w:styleId="TOC1">
+    <w:name w:val="toc 1"/>
+    <w:basedOn w:val="Normal"/>
+    <w:next w:val="Normal"/>
+    <w:autoRedefine/>
+    <w:uiPriority w:val="39"/>
+    <w:unhideWhenUsed/>
+    <w:rsid w:val="00FF7EAA"/>
+    <w:pPr>
+      <w:spacing w:after="100"/>
+    </w:pPr>
+  </w:style>
+  <w:style w:type="character" w:styleId="PlaceholderText">
+    <w:name w:val="Placeholder Text"/>
+    <w:basedOn w:val="DefaultParagraphFont"/>
+    <w:uiPriority w:val="99"/>
+    <w:semiHidden/>
+    <w:rsid w:val="00B32C31"/>
+    <w:rPr>
+      <w:color w:val="666666"/>
     </w:rPr>
   </w:style>
 </w:styles>
@@ -1301,4 +3397,16 @@
     </a:ext>
   </a:extLst>
 </a:theme>
+</file>
+
+<file path=customXml/item1.xml><?xml version="1.0" encoding="utf-8"?>
+<b:Sources xmlns:b="http://schemas.openxmlformats.org/officeDocument/2006/bibliography" xmlns="http://schemas.openxmlformats.org/officeDocument/2006/bibliography" SelectedStyle="\APASixthEditionOfficeOnline.xsl" StyleName="APA" Version="6"/>
+</file>
+
+<file path=customXml/itemProps1.xml><?xml version="1.0" encoding="utf-8"?>
+<ds:datastoreItem xmlns:ds="http://schemas.openxmlformats.org/officeDocument/2006/customXml" ds:itemID="{8E997CAD-C68A-474B-96AA-96D30EC4D79A}">
+  <ds:schemaRefs>
+    <ds:schemaRef ds:uri="http://schemas.openxmlformats.org/officeDocument/2006/bibliography"/>
+  </ds:schemaRefs>
+</ds:datastoreItem>
 </file>
</xml_diff>

<commit_message>
fix: uppercase Partofspeech Support
</commit_message>
<xml_diff>
--- a/Projektdokumentation.docx
+++ b/Projektdokumentation.docx
@@ -141,6 +141,7 @@
       </w:pPr>
       <w:r>
         <w:rPr>
+          <w:noProof/>
           <w:color w:val="0B769F" w:themeColor="accent4" w:themeShade="BF"/>
           <w:sz w:val="44"/>
           <w:szCs w:val="44"/>
@@ -717,7 +718,13 @@
     <w:sdt>
       <w:sdtPr>
         <w:rPr>
+          <w:rFonts w:asciiTheme="minorHAnsi" w:eastAsiaTheme="minorHAnsi" w:hAnsiTheme="minorHAnsi" w:cstheme="minorBidi"/>
+          <w:color w:val="auto"/>
+          <w:kern w:val="2"/>
+          <w:sz w:val="24"/>
+          <w:szCs w:val="24"/>
           <w:lang w:val="de-CH"/>
+          <w14:ligatures w14:val="standardContextual"/>
         </w:rPr>
         <w:id w:val="1061686563"/>
         <w:docPartObj>
@@ -727,15 +734,9 @@
       </w:sdtPr>
       <w:sdtEndPr>
         <w:rPr>
-          <w:rFonts w:asciiTheme="minorHAnsi" w:eastAsiaTheme="minorHAnsi" w:hAnsiTheme="minorHAnsi" w:cstheme="minorBidi"/>
           <w:b/>
           <w:bCs/>
           <w:noProof/>
-          <w:color w:val="auto"/>
-          <w:kern w:val="2"/>
-          <w:sz w:val="24"/>
-          <w:szCs w:val="24"/>
-          <w14:ligatures w14:val="standardContextual"/>
         </w:rPr>
       </w:sdtEndPr>
       <w:sdtContent>
@@ -1540,11 +1541,510 @@
         <w:lastRenderedPageBreak/>
         <w:t>Anforderungskatalog</w:t>
       </w:r>
+      <w:bookmarkStart w:id="2" w:name="_Toc231032602"/>
       <w:bookmarkEnd w:id="1"/>
     </w:p>
+    <w:tbl>
+      <w:tblPr>
+        <w:tblStyle w:val="TableGrid"/>
+        <w:tblW w:w="0" w:type="auto"/>
+        <w:tblLook w:val="04A0" w:firstRow="1" w:lastRow="0" w:firstColumn="1" w:lastColumn="0" w:noHBand="0" w:noVBand="1"/>
+      </w:tblPr>
+      <w:tblGrid>
+        <w:gridCol w:w="3005"/>
+        <w:gridCol w:w="3005"/>
+        <w:gridCol w:w="3006"/>
+      </w:tblGrid>
+      <w:tr>
+        <w:tc>
+          <w:tcPr>
+            <w:tcW w:w="3005" w:type="dxa"/>
+          </w:tcPr>
+          <w:p>
+            <w:pPr>
+              <w:rPr>
+                <w:b/>
+                <w:bCs/>
+              </w:rPr>
+            </w:pPr>
+            <w:r>
+              <w:rPr>
+                <w:b/>
+                <w:bCs/>
+              </w:rPr>
+              <w:t>ID</w:t>
+            </w:r>
+          </w:p>
+        </w:tc>
+        <w:tc>
+          <w:tcPr>
+            <w:tcW w:w="3005" w:type="dxa"/>
+          </w:tcPr>
+          <w:p>
+            <w:pPr>
+              <w:rPr>
+                <w:b/>
+                <w:bCs/>
+              </w:rPr>
+            </w:pPr>
+            <w:r>
+              <w:rPr>
+                <w:b/>
+                <w:bCs/>
+              </w:rPr>
+              <w:t>User Story</w:t>
+            </w:r>
+          </w:p>
+        </w:tc>
+        <w:tc>
+          <w:tcPr>
+            <w:tcW w:w="3006" w:type="dxa"/>
+          </w:tcPr>
+          <w:p>
+            <w:pPr>
+              <w:rPr>
+                <w:b/>
+                <w:bCs/>
+              </w:rPr>
+            </w:pPr>
+            <w:r>
+              <w:rPr>
+                <w:b/>
+                <w:bCs/>
+              </w:rPr>
+              <w:t>Akzeptanzkriterien</w:t>
+            </w:r>
+          </w:p>
+        </w:tc>
+      </w:tr>
+      <w:tr>
+        <w:tc>
+          <w:tcPr>
+            <w:tcW w:w="3005" w:type="dxa"/>
+          </w:tcPr>
+          <w:p>
+            <w:r>
+              <w:t>US</w:t>
+            </w:r>
+            <w:r>
+              <w:t>1</w:t>
+            </w:r>
+          </w:p>
+        </w:tc>
+        <w:tc>
+          <w:tcPr>
+            <w:tcW w:w="3005" w:type="dxa"/>
+          </w:tcPr>
+          <w:p>
+            <w:r>
+              <w:t>Als Benutzer*in möchte ich ein zufälliges Wort angezeigt bekommen, damit ich meinen Wortschatz erweitern kann.</w:t>
+            </w:r>
+          </w:p>
+        </w:tc>
+        <w:tc>
+          <w:tcPr>
+            <w:tcW w:w="3006" w:type="dxa"/>
+          </w:tcPr>
+          <w:p>
+            <w:pPr>
+              <w:pStyle w:val="ListParagraph"/>
+              <w:numPr>
+                <w:ilvl w:val="0"/>
+                <w:numId w:val="4"/>
+              </w:numPr>
+            </w:pPr>
+            <w:r>
+              <w:t>Auf der Startseite / Search-Seite ist ein Button "Go" sichtbar</w:t>
+            </w:r>
+          </w:p>
+          <w:p>
+            <w:pPr>
+              <w:pStyle w:val="ListParagraph"/>
+              <w:numPr>
+                <w:ilvl w:val="0"/>
+                <w:numId w:val="4"/>
+              </w:numPr>
+            </w:pPr>
+            <w:r>
+              <w:t>Beim Klick wird ein</w:t>
+            </w:r>
+            <w:r>
+              <w:t xml:space="preserve"> zufälliges</w:t>
+            </w:r>
+            <w:r>
+              <w:t xml:space="preserve"> Wort angezeigt</w:t>
+            </w:r>
+          </w:p>
+          <w:p>
+            <w:pPr>
+              <w:pStyle w:val="ListParagraph"/>
+              <w:numPr>
+                <w:ilvl w:val="0"/>
+                <w:numId w:val="4"/>
+              </w:numPr>
+            </w:pPr>
+            <w:r>
+              <w:t>Pro Wort werden Aussprache, Silbenanzahl und mindestens eine mögliche Definition angezeigt</w:t>
+            </w:r>
+          </w:p>
+          <w:p>
+            <w:pPr>
+              <w:pStyle w:val="ListParagraph"/>
+              <w:numPr>
+                <w:ilvl w:val="0"/>
+                <w:numId w:val="4"/>
+              </w:numPr>
+            </w:pPr>
+            <w:r>
+              <w:t>Fehlermeldungen werden, falls nötig, angezeigt</w:t>
+            </w:r>
+          </w:p>
+        </w:tc>
+      </w:tr>
+      <w:tr>
+        <w:tc>
+          <w:tcPr>
+            <w:tcW w:w="3005" w:type="dxa"/>
+          </w:tcPr>
+          <w:p>
+            <w:r>
+              <w:t>US</w:t>
+            </w:r>
+            <w:r>
+              <w:t>2</w:t>
+            </w:r>
+          </w:p>
+        </w:tc>
+        <w:tc>
+          <w:tcPr>
+            <w:tcW w:w="3005" w:type="dxa"/>
+          </w:tcPr>
+          <w:p>
+            <w:r>
+              <w:t xml:space="preserve">Als Benutzer*in möchte ich Definitionen als Favoriten speichern, damit ich wichtige </w:t>
+            </w:r>
+            <w:r>
+              <w:t xml:space="preserve">Definitionen mit persönlichen Notizen </w:t>
+            </w:r>
+            <w:r>
+              <w:t>schnell wiederfinden</w:t>
+            </w:r>
+            <w:r>
+              <w:t xml:space="preserve"> kann.</w:t>
+            </w:r>
+          </w:p>
+        </w:tc>
+        <w:tc>
+          <w:tcPr>
+            <w:tcW w:w="3006" w:type="dxa"/>
+          </w:tcPr>
+          <w:p>
+            <w:pPr>
+              <w:pStyle w:val="ListParagraph"/>
+              <w:numPr>
+                <w:ilvl w:val="0"/>
+                <w:numId w:val="6"/>
+              </w:numPr>
+            </w:pPr>
+            <w:r>
+              <w:t>Auf der Startseite wird mindestens eine Definition mit einem Herz-Button daneben angezeigt</w:t>
+            </w:r>
+          </w:p>
+          <w:p>
+            <w:pPr>
+              <w:pStyle w:val="ListParagraph"/>
+              <w:numPr>
+                <w:ilvl w:val="0"/>
+                <w:numId w:val="6"/>
+              </w:numPr>
+            </w:pPr>
+            <w:r>
+              <w:t xml:space="preserve">Beim Klick öffnet sich ein </w:t>
+            </w:r>
+            <w:r>
+              <w:t>Formular mit einem "Save"-Button</w:t>
+            </w:r>
+          </w:p>
+          <w:p>
+            <w:pPr>
+              <w:pStyle w:val="ListParagraph"/>
+              <w:numPr>
+                <w:ilvl w:val="0"/>
+                <w:numId w:val="6"/>
+              </w:numPr>
+            </w:pPr>
+            <w:r>
+              <w:t>Das Formular enthält ein Notizfeld (optional)</w:t>
+            </w:r>
+          </w:p>
+          <w:p>
+            <w:pPr>
+              <w:pStyle w:val="ListParagraph"/>
+              <w:numPr>
+                <w:ilvl w:val="0"/>
+                <w:numId w:val="6"/>
+              </w:numPr>
+            </w:pPr>
+            <w:r>
+              <w:t xml:space="preserve">Beim Klick auf den Save-Button wird die Definition </w:t>
+            </w:r>
+            <w:r>
+              <w:t>via REST-API als Favorit markiert</w:t>
+            </w:r>
+          </w:p>
+          <w:p>
+            <w:pPr>
+              <w:pStyle w:val="ListParagraph"/>
+              <w:numPr>
+                <w:ilvl w:val="0"/>
+                <w:numId w:val="6"/>
+              </w:numPr>
+            </w:pPr>
+            <w:r>
+              <w:t>Fehlermeldungen werden angezeigt, falls nötig</w:t>
+            </w:r>
+          </w:p>
+          <w:p>
+            <w:pPr>
+              <w:pStyle w:val="ListParagraph"/>
+              <w:numPr>
+                <w:ilvl w:val="0"/>
+                <w:numId w:val="6"/>
+              </w:numPr>
+            </w:pPr>
+            <w:r>
+              <w:t>Gespeicherte Favoriten erscheinen auf der Favoriten-Seite</w:t>
+            </w:r>
+          </w:p>
+        </w:tc>
+      </w:tr>
+      <w:tr>
+        <w:tc>
+          <w:tcPr>
+            <w:tcW w:w="3005" w:type="dxa"/>
+          </w:tcPr>
+          <w:p>
+            <w:r>
+              <w:t>US</w:t>
+            </w:r>
+            <w:r>
+              <w:t>3</w:t>
+            </w:r>
+          </w:p>
+        </w:tc>
+        <w:tc>
+          <w:tcPr>
+            <w:tcW w:w="3005" w:type="dxa"/>
+          </w:tcPr>
+          <w:p>
+            <w:r>
+              <w:t xml:space="preserve">Als Admin möchte ich neue Wörter erfassen, </w:t>
+            </w:r>
+            <w:r>
+              <w:lastRenderedPageBreak/>
+              <w:t>damit die Wort Bank wächst.</w:t>
+            </w:r>
+          </w:p>
+        </w:tc>
+        <w:tc>
+          <w:tcPr>
+            <w:tcW w:w="3006" w:type="dxa"/>
+          </w:tcPr>
+          <w:p>
+            <w:pPr>
+              <w:pStyle w:val="ListParagraph"/>
+              <w:numPr>
+                <w:ilvl w:val="0"/>
+                <w:numId w:val="5"/>
+              </w:numPr>
+            </w:pPr>
+            <w:r>
+              <w:lastRenderedPageBreak/>
+              <w:t>Auf der Admin</w:t>
+            </w:r>
+            <w:r>
+              <w:t>-</w:t>
+            </w:r>
+            <w:r>
+              <w:t>Seite wird ein "</w:t>
+            </w:r>
+            <w:r>
+              <w:t xml:space="preserve">New </w:t>
+            </w:r>
+            <w:r>
+              <w:lastRenderedPageBreak/>
+              <w:t>Word"-Button angezeigt</w:t>
+            </w:r>
+          </w:p>
+          <w:p>
+            <w:pPr>
+              <w:pStyle w:val="ListParagraph"/>
+              <w:numPr>
+                <w:ilvl w:val="0"/>
+                <w:numId w:val="5"/>
+              </w:numPr>
+            </w:pPr>
+            <w:r>
+              <w:t>Beim Klic</w:t>
+            </w:r>
+            <w:r>
+              <w:t>k wird ein Formular geöffnet</w:t>
+            </w:r>
+          </w:p>
+          <w:p>
+            <w:pPr>
+              <w:pStyle w:val="ListParagraph"/>
+              <w:numPr>
+                <w:ilvl w:val="0"/>
+                <w:numId w:val="5"/>
+              </w:numPr>
+            </w:pPr>
+            <w:r>
+              <w:t>Mehrere Definitionen pro Wort können vor dem Speichern hinzugefügt werden</w:t>
+            </w:r>
+          </w:p>
+          <w:p>
+            <w:pPr>
+              <w:pStyle w:val="ListParagraph"/>
+              <w:numPr>
+                <w:ilvl w:val="0"/>
+                <w:numId w:val="5"/>
+              </w:numPr>
+            </w:pPr>
+            <w:r>
+              <w:t>Pflichtfelder werden client-seitig validiert</w:t>
+            </w:r>
+          </w:p>
+          <w:p>
+            <w:pPr>
+              <w:pStyle w:val="ListParagraph"/>
+              <w:numPr>
+                <w:ilvl w:val="0"/>
+                <w:numId w:val="5"/>
+              </w:numPr>
+            </w:pPr>
+            <w:r>
+              <w:t>Beim Absenden wird d</w:t>
+            </w:r>
+            <w:r>
+              <w:t>as Wort</w:t>
+            </w:r>
+            <w:r>
+              <w:t xml:space="preserve"> via REST-API gespeichert</w:t>
+            </w:r>
+          </w:p>
+          <w:p>
+            <w:pPr>
+              <w:pStyle w:val="ListParagraph"/>
+              <w:numPr>
+                <w:ilvl w:val="0"/>
+                <w:numId w:val="5"/>
+              </w:numPr>
+            </w:pPr>
+            <w:r>
+              <w:t>Eine Fehlermeldung wird angezeigt, falls nötig</w:t>
+            </w:r>
+          </w:p>
+          <w:p>
+            <w:pPr>
+              <w:pStyle w:val="ListParagraph"/>
+              <w:numPr>
+                <w:ilvl w:val="0"/>
+                <w:numId w:val="5"/>
+              </w:numPr>
+            </w:pPr>
+            <w:r>
+              <w:t>Das neue Wort erscheint sofort in der Admin-Liste</w:t>
+            </w:r>
+          </w:p>
+        </w:tc>
+      </w:tr>
+      <w:tr>
+        <w:tc>
+          <w:tcPr>
+            <w:tcW w:w="3005" w:type="dxa"/>
+          </w:tcPr>
+          <w:p>
+            <w:r>
+              <w:lastRenderedPageBreak/>
+              <w:t>US</w:t>
+            </w:r>
+            <w:r>
+              <w:t>4</w:t>
+            </w:r>
+          </w:p>
+        </w:tc>
+        <w:tc>
+          <w:tcPr>
+            <w:tcW w:w="3005" w:type="dxa"/>
+          </w:tcPr>
+          <w:p>
+            <w:r>
+              <w:t>Als Admin möchte ich Wörter löschen können, damit veraltete oder fehlerhafte Einträge entfernt werden.</w:t>
+            </w:r>
+          </w:p>
+        </w:tc>
+        <w:tc>
+          <w:tcPr>
+            <w:tcW w:w="3006" w:type="dxa"/>
+          </w:tcPr>
+          <w:p>
+            <w:pPr>
+              <w:pStyle w:val="ListParagraph"/>
+              <w:numPr>
+                <w:ilvl w:val="0"/>
+                <w:numId w:val="5"/>
+              </w:numPr>
+            </w:pPr>
+            <w:r>
+              <w:t>Auf der Admin-Seite werden Wörter mit je einem "Delete"-Button angezeigt</w:t>
+            </w:r>
+          </w:p>
+          <w:p>
+            <w:pPr>
+              <w:pStyle w:val="ListParagraph"/>
+              <w:numPr>
+                <w:ilvl w:val="0"/>
+                <w:numId w:val="5"/>
+              </w:numPr>
+            </w:pPr>
+            <w:r>
+              <w:t>Beim Klick wird das richtige Wort per REST-API gelöscht</w:t>
+            </w:r>
+          </w:p>
+          <w:p>
+            <w:pPr>
+              <w:pStyle w:val="ListParagraph"/>
+              <w:numPr>
+                <w:ilvl w:val="0"/>
+                <w:numId w:val="5"/>
+              </w:numPr>
+            </w:pPr>
+            <w:r>
+              <w:t>Das Wort wird nicht mehr angezeigt und ist auch nicht mehr in der Datenbank</w:t>
+            </w:r>
+          </w:p>
+          <w:p>
+            <w:pPr>
+              <w:pStyle w:val="ListParagraph"/>
+              <w:numPr>
+                <w:ilvl w:val="0"/>
+                <w:numId w:val="5"/>
+              </w:numPr>
+            </w:pPr>
+            <w:r>
+              <w:t>Bei einem Fehler wird das Wort entsprechend nicht entfernt</w:t>
+            </w:r>
+          </w:p>
+        </w:tc>
+      </w:tr>
+    </w:tbl>
     <w:p>
       <w:pPr>
-        <w:pStyle w:val="Heading1"/>
+        <w:rPr>
+          <w:b/>
+          <w:bCs/>
+        </w:rPr>
         <w:sectPr>
           <w:pgSz w:w="11906" w:h="16838"/>
           <w:pgMar w:top="1440" w:right="1440" w:bottom="1440" w:left="1440" w:header="708" w:footer="708" w:gutter="0"/>
@@ -1553,7 +2053,6 @@
           <w:docGrid w:linePitch="360"/>
         </w:sectPr>
       </w:pPr>
-      <w:bookmarkStart w:id="2" w:name="_Toc231032602"/>
     </w:p>
     <w:p>
       <w:pPr>
@@ -1566,8 +2065,10 @@
       <w:bookmarkEnd w:id="2"/>
     </w:p>
     <w:p>
-      <w:pPr>
-        <w:pStyle w:val="Heading1"/>
+      <w:bookmarkStart w:id="3" w:name="_Toc231032603"/>
+    </w:p>
+    <w:p>
+      <w:pPr>
         <w:sectPr>
           <w:pgSz w:w="11906" w:h="16838"/>
           <w:pgMar w:top="1440" w:right="1440" w:bottom="1440" w:left="1440" w:header="708" w:footer="708" w:gutter="0"/>
@@ -1576,7 +2077,6 @@
           <w:docGrid w:linePitch="360"/>
         </w:sectPr>
       </w:pPr>
-      <w:bookmarkStart w:id="3" w:name="_Toc231032603"/>
     </w:p>
     <w:p>
       <w:pPr>
@@ -1962,6 +2462,321 @@
 <file path=word/numbering.xml><?xml version="1.0" encoding="utf-8"?>
 <w:numbering xmlns:wpc="http://schemas.microsoft.com/office/word/2010/wordprocessingCanvas" xmlns:cx="http://schemas.microsoft.com/office/drawing/2014/chartex" xmlns:cx1="http://schemas.microsoft.com/office/drawing/2015/9/8/chartex" xmlns:cx2="http://schemas.microsoft.com/office/drawing/2015/10/21/chartex" xmlns:cx3="http://schemas.microsoft.com/office/drawing/2016/5/9/chartex" xmlns:cx4="http://schemas.microsoft.com/office/drawing/2016/5/10/chartex" xmlns:cx5="http://schemas.microsoft.com/office/drawing/2016/5/11/chartex" xmlns:cx6="http://schemas.microsoft.com/office/drawing/2016/5/12/chartex" xmlns:cx7="http://schemas.microsoft.com/office/drawing/2016/5/13/chartex" xmlns:cx8="http://schemas.microsoft.com/office/drawing/2016/5/14/chartex" xmlns:mc="http://schemas.openxmlformats.org/markup-compatibility/2006" xmlns:aink="http://schemas.microsoft.com/office/drawing/2016/ink" xmlns:am3d="http://schemas.microsoft.com/office/drawing/2017/model3d" xmlns:o="urn:schemas-microsoft-com:office:office" xmlns:oel="http://schemas.microsoft.com/office/2019/extlst" xmlns:r="http://schemas.openxmlformats.org/officeDocument/2006/relationships" xmlns:m="http://schemas.openxmlformats.org/officeDocument/2006/math" xmlns:v="urn:schemas-microsoft-com:vml" xmlns:wp14="http://schemas.microsoft.com/office/word/2010/wordprocessingDrawing" xmlns:wp="http://schemas.openxmlformats.org/drawingml/2006/wordprocessingDrawing" xmlns:w10="urn:schemas-microsoft-com:office:word" xmlns:w="http://schemas.openxmlformats.org/wordprocessingml/2006/main" xmlns:w14="http://schemas.microsoft.com/office/word/2010/wordml" xmlns:w15="http://schemas.microsoft.com/office/word/2012/wordml" xmlns:w16cex="http://schemas.microsoft.com/office/word/2018/wordml/cex" xmlns:w16cid="http://schemas.microsoft.com/office/word/2016/wordml/cid" xmlns:w16="http://schemas.microsoft.com/office/word/2018/wordml" xmlns:w16du="http://schemas.microsoft.com/office/word/2023/wordml/word16du" xmlns:w16sdtdh="http://schemas.microsoft.com/office/word/2020/wordml/sdtdatahash" xmlns:w16sdtfl="http://schemas.microsoft.com/office/word/2024/wordml/sdtformatlock" xmlns:w16se="http://schemas.microsoft.com/office/word/2015/wordml/symex" xmlns:wpg="http://schemas.microsoft.com/office/word/2010/wordprocessingGroup" xmlns:wpi="http://schemas.microsoft.com/office/word/2010/wordprocessingInk" xmlns:wne="http://schemas.microsoft.com/office/word/2006/wordml" xmlns:wps="http://schemas.microsoft.com/office/word/2010/wordprocessingShape" mc:Ignorable="w14 w15 w16se w16cid w16 w16cex w16sdtdh w16sdtfl w16du wp14">
   <w:abstractNum w:abstractNumId="0" w15:restartNumberingAfterBreak="0">
+    <w:nsid w:val="0F7665FC"/>
+    <w:multiLevelType w:val="hybridMultilevel"/>
+    <w:tmpl w:val="A6E078F6"/>
+    <w:lvl w:ilvl="0" w:tplc="F0C44E72">
+      <w:start w:val="1"/>
+      <w:numFmt w:val="decimal"/>
+      <w:lvlText w:val="User-Story %1."/>
+      <w:lvlJc w:val="left"/>
+      <w:pPr>
+        <w:ind w:left="720" w:hanging="360"/>
+      </w:pPr>
+      <w:rPr>
+        <w:rFonts w:hint="default"/>
+      </w:rPr>
+    </w:lvl>
+    <w:lvl w:ilvl="1" w:tplc="08070019" w:tentative="1">
+      <w:start w:val="1"/>
+      <w:numFmt w:val="lowerLetter"/>
+      <w:lvlText w:val="%2."/>
+      <w:lvlJc w:val="left"/>
+      <w:pPr>
+        <w:ind w:left="1440" w:hanging="360"/>
+      </w:pPr>
+    </w:lvl>
+    <w:lvl w:ilvl="2" w:tplc="0807001B" w:tentative="1">
+      <w:start w:val="1"/>
+      <w:numFmt w:val="lowerRoman"/>
+      <w:lvlText w:val="%3."/>
+      <w:lvlJc w:val="right"/>
+      <w:pPr>
+        <w:ind w:left="2160" w:hanging="180"/>
+      </w:pPr>
+    </w:lvl>
+    <w:lvl w:ilvl="3" w:tplc="0807000F" w:tentative="1">
+      <w:start w:val="1"/>
+      <w:numFmt w:val="decimal"/>
+      <w:lvlText w:val="%4."/>
+      <w:lvlJc w:val="left"/>
+      <w:pPr>
+        <w:ind w:left="2880" w:hanging="360"/>
+      </w:pPr>
+    </w:lvl>
+    <w:lvl w:ilvl="4" w:tplc="08070019" w:tentative="1">
+      <w:start w:val="1"/>
+      <w:numFmt w:val="lowerLetter"/>
+      <w:lvlText w:val="%5."/>
+      <w:lvlJc w:val="left"/>
+      <w:pPr>
+        <w:ind w:left="3600" w:hanging="360"/>
+      </w:pPr>
+    </w:lvl>
+    <w:lvl w:ilvl="5" w:tplc="0807001B" w:tentative="1">
+      <w:start w:val="1"/>
+      <w:numFmt w:val="lowerRoman"/>
+      <w:lvlText w:val="%6."/>
+      <w:lvlJc w:val="right"/>
+      <w:pPr>
+        <w:ind w:left="4320" w:hanging="180"/>
+      </w:pPr>
+    </w:lvl>
+    <w:lvl w:ilvl="6" w:tplc="0807000F" w:tentative="1">
+      <w:start w:val="1"/>
+      <w:numFmt w:val="decimal"/>
+      <w:lvlText w:val="%7."/>
+      <w:lvlJc w:val="left"/>
+      <w:pPr>
+        <w:ind w:left="5040" w:hanging="360"/>
+      </w:pPr>
+    </w:lvl>
+    <w:lvl w:ilvl="7" w:tplc="08070019" w:tentative="1">
+      <w:start w:val="1"/>
+      <w:numFmt w:val="lowerLetter"/>
+      <w:lvlText w:val="%8."/>
+      <w:lvlJc w:val="left"/>
+      <w:pPr>
+        <w:ind w:left="5760" w:hanging="360"/>
+      </w:pPr>
+    </w:lvl>
+    <w:lvl w:ilvl="8" w:tplc="0807001B" w:tentative="1">
+      <w:start w:val="1"/>
+      <w:numFmt w:val="lowerRoman"/>
+      <w:lvlText w:val="%9."/>
+      <w:lvlJc w:val="right"/>
+      <w:pPr>
+        <w:ind w:left="6480" w:hanging="180"/>
+      </w:pPr>
+    </w:lvl>
+  </w:abstractNum>
+  <w:abstractNum w:abstractNumId="1" w15:restartNumberingAfterBreak="0">
+    <w:nsid w:val="2C7E1EEC"/>
+    <w:multiLevelType w:val="hybridMultilevel"/>
+    <w:tmpl w:val="E83C0D54"/>
+    <w:lvl w:ilvl="0" w:tplc="08070001">
+      <w:start w:val="1"/>
+      <w:numFmt w:val="bullet"/>
+      <w:lvlText w:val=""/>
+      <w:lvlJc w:val="left"/>
+      <w:pPr>
+        <w:ind w:left="720" w:hanging="360"/>
+      </w:pPr>
+      <w:rPr>
+        <w:rFonts w:ascii="Symbol" w:hAnsi="Symbol" w:hint="default"/>
+      </w:rPr>
+    </w:lvl>
+    <w:lvl w:ilvl="1" w:tplc="08070003">
+      <w:start w:val="1"/>
+      <w:numFmt w:val="bullet"/>
+      <w:lvlText w:val="o"/>
+      <w:lvlJc w:val="left"/>
+      <w:pPr>
+        <w:ind w:left="1440" w:hanging="360"/>
+      </w:pPr>
+      <w:rPr>
+        <w:rFonts w:ascii="Courier New" w:hAnsi="Courier New" w:cs="Courier New" w:hint="default"/>
+      </w:rPr>
+    </w:lvl>
+    <w:lvl w:ilvl="2" w:tplc="08070005" w:tentative="1">
+      <w:start w:val="1"/>
+      <w:numFmt w:val="bullet"/>
+      <w:lvlText w:val=""/>
+      <w:lvlJc w:val="left"/>
+      <w:pPr>
+        <w:ind w:left="2160" w:hanging="360"/>
+      </w:pPr>
+      <w:rPr>
+        <w:rFonts w:ascii="Wingdings" w:hAnsi="Wingdings" w:hint="default"/>
+      </w:rPr>
+    </w:lvl>
+    <w:lvl w:ilvl="3" w:tplc="08070001" w:tentative="1">
+      <w:start w:val="1"/>
+      <w:numFmt w:val="bullet"/>
+      <w:lvlText w:val=""/>
+      <w:lvlJc w:val="left"/>
+      <w:pPr>
+        <w:ind w:left="2880" w:hanging="360"/>
+      </w:pPr>
+      <w:rPr>
+        <w:rFonts w:ascii="Symbol" w:hAnsi="Symbol" w:hint="default"/>
+      </w:rPr>
+    </w:lvl>
+    <w:lvl w:ilvl="4" w:tplc="08070003" w:tentative="1">
+      <w:start w:val="1"/>
+      <w:numFmt w:val="bullet"/>
+      <w:lvlText w:val="o"/>
+      <w:lvlJc w:val="left"/>
+      <w:pPr>
+        <w:ind w:left="3600" w:hanging="360"/>
+      </w:pPr>
+      <w:rPr>
+        <w:rFonts w:ascii="Courier New" w:hAnsi="Courier New" w:cs="Courier New" w:hint="default"/>
+      </w:rPr>
+    </w:lvl>
+    <w:lvl w:ilvl="5" w:tplc="08070005" w:tentative="1">
+      <w:start w:val="1"/>
+      <w:numFmt w:val="bullet"/>
+      <w:lvlText w:val=""/>
+      <w:lvlJc w:val="left"/>
+      <w:pPr>
+        <w:ind w:left="4320" w:hanging="360"/>
+      </w:pPr>
+      <w:rPr>
+        <w:rFonts w:ascii="Wingdings" w:hAnsi="Wingdings" w:hint="default"/>
+      </w:rPr>
+    </w:lvl>
+    <w:lvl w:ilvl="6" w:tplc="08070001" w:tentative="1">
+      <w:start w:val="1"/>
+      <w:numFmt w:val="bullet"/>
+      <w:lvlText w:val=""/>
+      <w:lvlJc w:val="left"/>
+      <w:pPr>
+        <w:ind w:left="5040" w:hanging="360"/>
+      </w:pPr>
+      <w:rPr>
+        <w:rFonts w:ascii="Symbol" w:hAnsi="Symbol" w:hint="default"/>
+      </w:rPr>
+    </w:lvl>
+    <w:lvl w:ilvl="7" w:tplc="08070003" w:tentative="1">
+      <w:start w:val="1"/>
+      <w:numFmt w:val="bullet"/>
+      <w:lvlText w:val="o"/>
+      <w:lvlJc w:val="left"/>
+      <w:pPr>
+        <w:ind w:left="5760" w:hanging="360"/>
+      </w:pPr>
+      <w:rPr>
+        <w:rFonts w:ascii="Courier New" w:hAnsi="Courier New" w:cs="Courier New" w:hint="default"/>
+      </w:rPr>
+    </w:lvl>
+    <w:lvl w:ilvl="8" w:tplc="08070005" w:tentative="1">
+      <w:start w:val="1"/>
+      <w:numFmt w:val="bullet"/>
+      <w:lvlText w:val=""/>
+      <w:lvlJc w:val="left"/>
+      <w:pPr>
+        <w:ind w:left="6480" w:hanging="360"/>
+      </w:pPr>
+      <w:rPr>
+        <w:rFonts w:ascii="Wingdings" w:hAnsi="Wingdings" w:hint="default"/>
+      </w:rPr>
+    </w:lvl>
+  </w:abstractNum>
+  <w:abstractNum w:abstractNumId="2" w15:restartNumberingAfterBreak="0">
+    <w:nsid w:val="36F9400B"/>
+    <w:multiLevelType w:val="hybridMultilevel"/>
+    <w:tmpl w:val="646E5516"/>
+    <w:lvl w:ilvl="0" w:tplc="08070001">
+      <w:start w:val="1"/>
+      <w:numFmt w:val="bullet"/>
+      <w:lvlText w:val=""/>
+      <w:lvlJc w:val="left"/>
+      <w:pPr>
+        <w:ind w:left="720" w:hanging="360"/>
+      </w:pPr>
+      <w:rPr>
+        <w:rFonts w:ascii="Symbol" w:hAnsi="Symbol" w:hint="default"/>
+      </w:rPr>
+    </w:lvl>
+    <w:lvl w:ilvl="1" w:tplc="08070003" w:tentative="1">
+      <w:start w:val="1"/>
+      <w:numFmt w:val="bullet"/>
+      <w:lvlText w:val="o"/>
+      <w:lvlJc w:val="left"/>
+      <w:pPr>
+        <w:ind w:left="1440" w:hanging="360"/>
+      </w:pPr>
+      <w:rPr>
+        <w:rFonts w:ascii="Courier New" w:hAnsi="Courier New" w:cs="Courier New" w:hint="default"/>
+      </w:rPr>
+    </w:lvl>
+    <w:lvl w:ilvl="2" w:tplc="08070005" w:tentative="1">
+      <w:start w:val="1"/>
+      <w:numFmt w:val="bullet"/>
+      <w:lvlText w:val=""/>
+      <w:lvlJc w:val="left"/>
+      <w:pPr>
+        <w:ind w:left="2160" w:hanging="360"/>
+      </w:pPr>
+      <w:rPr>
+        <w:rFonts w:ascii="Wingdings" w:hAnsi="Wingdings" w:hint="default"/>
+      </w:rPr>
+    </w:lvl>
+    <w:lvl w:ilvl="3" w:tplc="08070001" w:tentative="1">
+      <w:start w:val="1"/>
+      <w:numFmt w:val="bullet"/>
+      <w:lvlText w:val=""/>
+      <w:lvlJc w:val="left"/>
+      <w:pPr>
+        <w:ind w:left="2880" w:hanging="360"/>
+      </w:pPr>
+      <w:rPr>
+        <w:rFonts w:ascii="Symbol" w:hAnsi="Symbol" w:hint="default"/>
+      </w:rPr>
+    </w:lvl>
+    <w:lvl w:ilvl="4" w:tplc="08070003" w:tentative="1">
+      <w:start w:val="1"/>
+      <w:numFmt w:val="bullet"/>
+      <w:lvlText w:val="o"/>
+      <w:lvlJc w:val="left"/>
+      <w:pPr>
+        <w:ind w:left="3600" w:hanging="360"/>
+      </w:pPr>
+      <w:rPr>
+        <w:rFonts w:ascii="Courier New" w:hAnsi="Courier New" w:cs="Courier New" w:hint="default"/>
+      </w:rPr>
+    </w:lvl>
+    <w:lvl w:ilvl="5" w:tplc="08070005" w:tentative="1">
+      <w:start w:val="1"/>
+      <w:numFmt w:val="bullet"/>
+      <w:lvlText w:val=""/>
+      <w:lvlJc w:val="left"/>
+      <w:pPr>
+        <w:ind w:left="4320" w:hanging="360"/>
+      </w:pPr>
+      <w:rPr>
+        <w:rFonts w:ascii="Wingdings" w:hAnsi="Wingdings" w:hint="default"/>
+      </w:rPr>
+    </w:lvl>
+    <w:lvl w:ilvl="6" w:tplc="08070001" w:tentative="1">
+      <w:start w:val="1"/>
+      <w:numFmt w:val="bullet"/>
+      <w:lvlText w:val=""/>
+      <w:lvlJc w:val="left"/>
+      <w:pPr>
+        <w:ind w:left="5040" w:hanging="360"/>
+      </w:pPr>
+      <w:rPr>
+        <w:rFonts w:ascii="Symbol" w:hAnsi="Symbol" w:hint="default"/>
+      </w:rPr>
+    </w:lvl>
+    <w:lvl w:ilvl="7" w:tplc="08070003" w:tentative="1">
+      <w:start w:val="1"/>
+      <w:numFmt w:val="bullet"/>
+      <w:lvlText w:val="o"/>
+      <w:lvlJc w:val="left"/>
+      <w:pPr>
+        <w:ind w:left="5760" w:hanging="360"/>
+      </w:pPr>
+      <w:rPr>
+        <w:rFonts w:ascii="Courier New" w:hAnsi="Courier New" w:cs="Courier New" w:hint="default"/>
+      </w:rPr>
+    </w:lvl>
+    <w:lvl w:ilvl="8" w:tplc="08070005" w:tentative="1">
+      <w:start w:val="1"/>
+      <w:numFmt w:val="bullet"/>
+      <w:lvlText w:val=""/>
+      <w:lvlJc w:val="left"/>
+      <w:pPr>
+        <w:ind w:left="6480" w:hanging="360"/>
+      </w:pPr>
+      <w:rPr>
+        <w:rFonts w:ascii="Wingdings" w:hAnsi="Wingdings" w:hint="default"/>
+      </w:rPr>
+    </w:lvl>
+  </w:abstractNum>
+  <w:abstractNum w:abstractNumId="3" w15:restartNumberingAfterBreak="0">
     <w:nsid w:val="4B8E504B"/>
     <w:multiLevelType w:val="hybridMultilevel"/>
     <w:tmpl w:val="8E3AE292"/>
@@ -2050,8 +2865,249 @@
       </w:pPr>
     </w:lvl>
   </w:abstractNum>
+  <w:abstractNum w:abstractNumId="4" w15:restartNumberingAfterBreak="0">
+    <w:nsid w:val="675B5C9E"/>
+    <w:multiLevelType w:val="hybridMultilevel"/>
+    <w:tmpl w:val="7F147F0A"/>
+    <w:lvl w:ilvl="0" w:tplc="08070001">
+      <w:start w:val="1"/>
+      <w:numFmt w:val="bullet"/>
+      <w:lvlText w:val=""/>
+      <w:lvlJc w:val="left"/>
+      <w:pPr>
+        <w:ind w:left="720" w:hanging="360"/>
+      </w:pPr>
+      <w:rPr>
+        <w:rFonts w:ascii="Symbol" w:hAnsi="Symbol" w:hint="default"/>
+      </w:rPr>
+    </w:lvl>
+    <w:lvl w:ilvl="1" w:tplc="08070003" w:tentative="1">
+      <w:start w:val="1"/>
+      <w:numFmt w:val="bullet"/>
+      <w:lvlText w:val="o"/>
+      <w:lvlJc w:val="left"/>
+      <w:pPr>
+        <w:ind w:left="1440" w:hanging="360"/>
+      </w:pPr>
+      <w:rPr>
+        <w:rFonts w:ascii="Courier New" w:hAnsi="Courier New" w:cs="Courier New" w:hint="default"/>
+      </w:rPr>
+    </w:lvl>
+    <w:lvl w:ilvl="2" w:tplc="08070005" w:tentative="1">
+      <w:start w:val="1"/>
+      <w:numFmt w:val="bullet"/>
+      <w:lvlText w:val=""/>
+      <w:lvlJc w:val="left"/>
+      <w:pPr>
+        <w:ind w:left="2160" w:hanging="360"/>
+      </w:pPr>
+      <w:rPr>
+        <w:rFonts w:ascii="Wingdings" w:hAnsi="Wingdings" w:hint="default"/>
+      </w:rPr>
+    </w:lvl>
+    <w:lvl w:ilvl="3" w:tplc="08070001" w:tentative="1">
+      <w:start w:val="1"/>
+      <w:numFmt w:val="bullet"/>
+      <w:lvlText w:val=""/>
+      <w:lvlJc w:val="left"/>
+      <w:pPr>
+        <w:ind w:left="2880" w:hanging="360"/>
+      </w:pPr>
+      <w:rPr>
+        <w:rFonts w:ascii="Symbol" w:hAnsi="Symbol" w:hint="default"/>
+      </w:rPr>
+    </w:lvl>
+    <w:lvl w:ilvl="4" w:tplc="08070003" w:tentative="1">
+      <w:start w:val="1"/>
+      <w:numFmt w:val="bullet"/>
+      <w:lvlText w:val="o"/>
+      <w:lvlJc w:val="left"/>
+      <w:pPr>
+        <w:ind w:left="3600" w:hanging="360"/>
+      </w:pPr>
+      <w:rPr>
+        <w:rFonts w:ascii="Courier New" w:hAnsi="Courier New" w:cs="Courier New" w:hint="default"/>
+      </w:rPr>
+    </w:lvl>
+    <w:lvl w:ilvl="5" w:tplc="08070005" w:tentative="1">
+      <w:start w:val="1"/>
+      <w:numFmt w:val="bullet"/>
+      <w:lvlText w:val=""/>
+      <w:lvlJc w:val="left"/>
+      <w:pPr>
+        <w:ind w:left="4320" w:hanging="360"/>
+      </w:pPr>
+      <w:rPr>
+        <w:rFonts w:ascii="Wingdings" w:hAnsi="Wingdings" w:hint="default"/>
+      </w:rPr>
+    </w:lvl>
+    <w:lvl w:ilvl="6" w:tplc="08070001" w:tentative="1">
+      <w:start w:val="1"/>
+      <w:numFmt w:val="bullet"/>
+      <w:lvlText w:val=""/>
+      <w:lvlJc w:val="left"/>
+      <w:pPr>
+        <w:ind w:left="5040" w:hanging="360"/>
+      </w:pPr>
+      <w:rPr>
+        <w:rFonts w:ascii="Symbol" w:hAnsi="Symbol" w:hint="default"/>
+      </w:rPr>
+    </w:lvl>
+    <w:lvl w:ilvl="7" w:tplc="08070003" w:tentative="1">
+      <w:start w:val="1"/>
+      <w:numFmt w:val="bullet"/>
+      <w:lvlText w:val="o"/>
+      <w:lvlJc w:val="left"/>
+      <w:pPr>
+        <w:ind w:left="5760" w:hanging="360"/>
+      </w:pPr>
+      <w:rPr>
+        <w:rFonts w:ascii="Courier New" w:hAnsi="Courier New" w:cs="Courier New" w:hint="default"/>
+      </w:rPr>
+    </w:lvl>
+    <w:lvl w:ilvl="8" w:tplc="08070005" w:tentative="1">
+      <w:start w:val="1"/>
+      <w:numFmt w:val="bullet"/>
+      <w:lvlText w:val=""/>
+      <w:lvlJc w:val="left"/>
+      <w:pPr>
+        <w:ind w:left="6480" w:hanging="360"/>
+      </w:pPr>
+      <w:rPr>
+        <w:rFonts w:ascii="Wingdings" w:hAnsi="Wingdings" w:hint="default"/>
+      </w:rPr>
+    </w:lvl>
+  </w:abstractNum>
+  <w:abstractNum w:abstractNumId="5" w15:restartNumberingAfterBreak="0">
+    <w:nsid w:val="718F551F"/>
+    <w:multiLevelType w:val="hybridMultilevel"/>
+    <w:tmpl w:val="7ED67944"/>
+    <w:lvl w:ilvl="0" w:tplc="08070001">
+      <w:start w:val="1"/>
+      <w:numFmt w:val="bullet"/>
+      <w:lvlText w:val=""/>
+      <w:lvlJc w:val="left"/>
+      <w:pPr>
+        <w:ind w:left="720" w:hanging="360"/>
+      </w:pPr>
+      <w:rPr>
+        <w:rFonts w:ascii="Symbol" w:hAnsi="Symbol" w:hint="default"/>
+      </w:rPr>
+    </w:lvl>
+    <w:lvl w:ilvl="1" w:tplc="08070003" w:tentative="1">
+      <w:start w:val="1"/>
+      <w:numFmt w:val="bullet"/>
+      <w:lvlText w:val="o"/>
+      <w:lvlJc w:val="left"/>
+      <w:pPr>
+        <w:ind w:left="1440" w:hanging="360"/>
+      </w:pPr>
+      <w:rPr>
+        <w:rFonts w:ascii="Courier New" w:hAnsi="Courier New" w:cs="Courier New" w:hint="default"/>
+      </w:rPr>
+    </w:lvl>
+    <w:lvl w:ilvl="2" w:tplc="08070005" w:tentative="1">
+      <w:start w:val="1"/>
+      <w:numFmt w:val="bullet"/>
+      <w:lvlText w:val=""/>
+      <w:lvlJc w:val="left"/>
+      <w:pPr>
+        <w:ind w:left="2160" w:hanging="360"/>
+      </w:pPr>
+      <w:rPr>
+        <w:rFonts w:ascii="Wingdings" w:hAnsi="Wingdings" w:hint="default"/>
+      </w:rPr>
+    </w:lvl>
+    <w:lvl w:ilvl="3" w:tplc="08070001" w:tentative="1">
+      <w:start w:val="1"/>
+      <w:numFmt w:val="bullet"/>
+      <w:lvlText w:val=""/>
+      <w:lvlJc w:val="left"/>
+      <w:pPr>
+        <w:ind w:left="2880" w:hanging="360"/>
+      </w:pPr>
+      <w:rPr>
+        <w:rFonts w:ascii="Symbol" w:hAnsi="Symbol" w:hint="default"/>
+      </w:rPr>
+    </w:lvl>
+    <w:lvl w:ilvl="4" w:tplc="08070003" w:tentative="1">
+      <w:start w:val="1"/>
+      <w:numFmt w:val="bullet"/>
+      <w:lvlText w:val="o"/>
+      <w:lvlJc w:val="left"/>
+      <w:pPr>
+        <w:ind w:left="3600" w:hanging="360"/>
+      </w:pPr>
+      <w:rPr>
+        <w:rFonts w:ascii="Courier New" w:hAnsi="Courier New" w:cs="Courier New" w:hint="default"/>
+      </w:rPr>
+    </w:lvl>
+    <w:lvl w:ilvl="5" w:tplc="08070005" w:tentative="1">
+      <w:start w:val="1"/>
+      <w:numFmt w:val="bullet"/>
+      <w:lvlText w:val=""/>
+      <w:lvlJc w:val="left"/>
+      <w:pPr>
+        <w:ind w:left="4320" w:hanging="360"/>
+      </w:pPr>
+      <w:rPr>
+        <w:rFonts w:ascii="Wingdings" w:hAnsi="Wingdings" w:hint="default"/>
+      </w:rPr>
+    </w:lvl>
+    <w:lvl w:ilvl="6" w:tplc="08070001" w:tentative="1">
+      <w:start w:val="1"/>
+      <w:numFmt w:val="bullet"/>
+      <w:lvlText w:val=""/>
+      <w:lvlJc w:val="left"/>
+      <w:pPr>
+        <w:ind w:left="5040" w:hanging="360"/>
+      </w:pPr>
+      <w:rPr>
+        <w:rFonts w:ascii="Symbol" w:hAnsi="Symbol" w:hint="default"/>
+      </w:rPr>
+    </w:lvl>
+    <w:lvl w:ilvl="7" w:tplc="08070003" w:tentative="1">
+      <w:start w:val="1"/>
+      <w:numFmt w:val="bullet"/>
+      <w:lvlText w:val="o"/>
+      <w:lvlJc w:val="left"/>
+      <w:pPr>
+        <w:ind w:left="5760" w:hanging="360"/>
+      </w:pPr>
+      <w:rPr>
+        <w:rFonts w:ascii="Courier New" w:hAnsi="Courier New" w:cs="Courier New" w:hint="default"/>
+      </w:rPr>
+    </w:lvl>
+    <w:lvl w:ilvl="8" w:tplc="08070005" w:tentative="1">
+      <w:start w:val="1"/>
+      <w:numFmt w:val="bullet"/>
+      <w:lvlText w:val=""/>
+      <w:lvlJc w:val="left"/>
+      <w:pPr>
+        <w:ind w:left="6480" w:hanging="360"/>
+      </w:pPr>
+      <w:rPr>
+        <w:rFonts w:ascii="Wingdings" w:hAnsi="Wingdings" w:hint="default"/>
+      </w:rPr>
+    </w:lvl>
+  </w:abstractNum>
   <w:num w:numId="1" w16cid:durableId="581918073">
+    <w:abstractNumId w:val="3"/>
+  </w:num>
+  <w:num w:numId="2" w16cid:durableId="1793016869">
     <w:abstractNumId w:val="0"/>
+  </w:num>
+  <w:num w:numId="3" w16cid:durableId="1139878361">
+    <w:abstractNumId w:val="1"/>
+  </w:num>
+  <w:num w:numId="4" w16cid:durableId="629676799">
+    <w:abstractNumId w:val="5"/>
+  </w:num>
+  <w:num w:numId="5" w16cid:durableId="1251814425">
+    <w:abstractNumId w:val="4"/>
+  </w:num>
+  <w:num w:numId="6" w16cid:durableId="366683109">
+    <w:abstractNumId w:val="2"/>
   </w:num>
 </w:numbering>
 </file>
@@ -2456,7 +3512,7 @@
   <w:style w:type="paragraph" w:default="1" w:styleId="Normal">
     <w:name w:val="Normal"/>
     <w:qFormat/>
-    <w:rsid w:val="00336F45"/>
+    <w:rsid w:val="00847A7A"/>
   </w:style>
   <w:style w:type="paragraph" w:styleId="Heading1">
     <w:name w:val="heading 1"/>
@@ -3081,6 +4137,25 @@
       <w:color w:val="666666"/>
     </w:rPr>
   </w:style>
+  <w:style w:type="table" w:styleId="TableGrid">
+    <w:name w:val="Table Grid"/>
+    <w:basedOn w:val="TableNormal"/>
+    <w:uiPriority w:val="39"/>
+    <w:rsid w:val="00FC30F3"/>
+    <w:pPr>
+      <w:spacing w:after="0" w:line="240" w:lineRule="auto"/>
+    </w:pPr>
+    <w:tblPr>
+      <w:tblBorders>
+        <w:top w:val="single" w:sz="4" w:space="0" w:color="auto"/>
+        <w:left w:val="single" w:sz="4" w:space="0" w:color="auto"/>
+        <w:bottom w:val="single" w:sz="4" w:space="0" w:color="auto"/>
+        <w:right w:val="single" w:sz="4" w:space="0" w:color="auto"/>
+        <w:insideH w:val="single" w:sz="4" w:space="0" w:color="auto"/>
+        <w:insideV w:val="single" w:sz="4" w:space="0" w:color="auto"/>
+      </w:tblBorders>
+    </w:tblPr>
+  </w:style>
 </w:styles>
 </file>
 

</xml_diff>

<commit_message>
fix: notiz bei FAVORTIES veränderbar
</commit_message>
<xml_diff>
--- a/Projektdokumentation.docx
+++ b/Projektdokumentation.docx
@@ -12,6 +12,7 @@
           <w:szCs w:val="96"/>
         </w:rPr>
       </w:pPr>
+      <w:proofErr w:type="spellStart"/>
       <w:r>
         <w:rPr>
           <w:rFonts w:asciiTheme="majorHAnsi" w:hAnsiTheme="majorHAnsi"/>
@@ -30,6 +31,7 @@
         </w:rPr>
         <w:t>ordBank</w:t>
       </w:r>
+      <w:proofErr w:type="spellEnd"/>
     </w:p>
     <w:p>
       <w:pPr>
@@ -1481,12 +1483,18 @@
       </w:r>
       <w:bookmarkEnd w:id="0"/>
     </w:p>
+    <w:p/>
     <w:p>
       <w:pPr>
         <w:spacing w:line="360" w:lineRule="auto"/>
       </w:pPr>
+      <w:proofErr w:type="spellStart"/>
       <w:r>
-        <w:t>WordBank ist eine interaktive Wörterbuch-Applikation</w:t>
+        <w:t>WordBank</w:t>
+      </w:r>
+      <w:proofErr w:type="spellEnd"/>
+      <w:r>
+        <w:t xml:space="preserve"> ist eine interaktive Wörterbuch-Applikation</w:t>
       </w:r>
       <w:r>
         <w:t>, die Benutzer*innen ermöglicht Wörter zu erkundigen und diese zu favorisieren.</w:t>
@@ -1544,6 +1552,7 @@
       <w:bookmarkStart w:id="2" w:name="_Toc231032602"/>
       <w:bookmarkEnd w:id="1"/>
     </w:p>
+    <w:p/>
     <w:tbl>
       <w:tblPr>
         <w:tblStyle w:val="TableGrid"/>
@@ -1825,6 +1834,7 @@
           </w:tcPr>
           <w:p>
             <w:r>
+              <w:lastRenderedPageBreak/>
               <w:t>US</w:t>
             </w:r>
             <w:r>
@@ -1838,11 +1848,7 @@
           </w:tcPr>
           <w:p>
             <w:r>
-              <w:t xml:space="preserve">Als Admin möchte ich neue Wörter erfassen, </w:t>
-            </w:r>
-            <w:r>
-              <w:lastRenderedPageBreak/>
-              <w:t>damit die Wort Bank wächst.</w:t>
+              <w:t>Als Admin möchte ich neue Wörter erfassen, damit die Wort Bank wächst.</w:t>
             </w:r>
           </w:p>
         </w:tc>
@@ -1859,7 +1865,6 @@
               </w:numPr>
             </w:pPr>
             <w:r>
-              <w:lastRenderedPageBreak/>
               <w:t>Auf der Admin</w:t>
             </w:r>
             <w:r>
@@ -1869,11 +1874,7 @@
               <w:t>Seite wird ein "</w:t>
             </w:r>
             <w:r>
-              <w:t xml:space="preserve">New </w:t>
-            </w:r>
-            <w:r>
-              <w:lastRenderedPageBreak/>
-              <w:t>Word"-Button angezeigt</w:t>
+              <w:t>New Word"-Button angezeigt</w:t>
             </w:r>
           </w:p>
           <w:p>
@@ -1966,7 +1967,6 @@
           </w:tcPr>
           <w:p>
             <w:r>
-              <w:lastRenderedPageBreak/>
               <w:t>US</w:t>
             </w:r>
             <w:r>
@@ -2064,8 +2064,61 @@
       </w:r>
       <w:bookmarkEnd w:id="2"/>
     </w:p>
+    <w:p/>
     <w:p>
-      <w:bookmarkStart w:id="3" w:name="_Toc231032603"/>
+      <w:pPr>
+        <w:jc w:val="center"/>
+      </w:pPr>
+      <w:r>
+        <w:drawing>
+          <wp:inline distT="0" distB="0" distL="0" distR="0" wp14:anchorId="259EFE87" wp14:editId="03D4072A">
+            <wp:extent cx="5711552" cy="5067300"/>
+            <wp:effectExtent l="0" t="0" r="3810" b="0"/>
+            <wp:docPr id="952197580" name="Picture 2" descr="This diagram illustrates a Word object with properties such as id, word, isFavoriteWord, results, syllables, and pronunciation, and it includes various types of linguistic relationships like enumeration, synonyms, antonyms, and part of speech.&#10;&#10;AI-generated content may be incorrect."/>
+            <wp:cNvGraphicFramePr>
+              <a:graphicFrameLocks xmlns:a="http://schemas.openxmlformats.org/drawingml/2006/main" noChangeAspect="1"/>
+            </wp:cNvGraphicFramePr>
+            <a:graphic xmlns:a="http://schemas.openxmlformats.org/drawingml/2006/main">
+              <a:graphicData uri="http://schemas.openxmlformats.org/drawingml/2006/picture">
+                <pic:pic xmlns:pic="http://schemas.openxmlformats.org/drawingml/2006/picture">
+                  <pic:nvPicPr>
+                    <pic:cNvPr id="952197580" name="Picture 2" descr="This diagram illustrates a Word object with properties such as id, word, isFavoriteWord, results, syllables, and pronunciation, and it includes various types of linguistic relationships like enumeration, synonyms, antonyms, and part of speech.&#10;&#10;AI-generated content may be incorrect."/>
+                    <pic:cNvPicPr>
+                      <a:picLocks noChangeAspect="1" noChangeArrowheads="1"/>
+                    </pic:cNvPicPr>
+                  </pic:nvPicPr>
+                  <pic:blipFill>
+                    <a:blip r:embed="rId14">
+                      <a:extLst>
+                        <a:ext uri="{28A0092B-C50C-407E-A947-70E740481C1C}">
+                          <a14:useLocalDpi xmlns:a14="http://schemas.microsoft.com/office/drawing/2010/main" val="0"/>
+                        </a:ext>
+                      </a:extLst>
+                    </a:blip>
+                    <a:srcRect/>
+                    <a:stretch>
+                      <a:fillRect/>
+                    </a:stretch>
+                  </pic:blipFill>
+                  <pic:spPr bwMode="auto">
+                    <a:xfrm>
+                      <a:off x="0" y="0"/>
+                      <a:ext cx="5727578" cy="5081518"/>
+                    </a:xfrm>
+                    <a:prstGeom prst="rect">
+                      <a:avLst/>
+                    </a:prstGeom>
+                    <a:noFill/>
+                    <a:ln>
+                      <a:noFill/>
+                    </a:ln>
+                  </pic:spPr>
+                </pic:pic>
+              </a:graphicData>
+            </a:graphic>
+          </wp:inline>
+        </w:drawing>
+      </w:r>
     </w:p>
     <w:p>
       <w:pPr>
@@ -2077,6 +2130,7 @@
           <w:docGrid w:linePitch="360"/>
         </w:sectPr>
       </w:pPr>
+      <w:bookmarkStart w:id="3" w:name="_Toc231032603"/>
     </w:p>
     <w:p>
       <w:pPr>
@@ -2087,6 +2141,30 @@
         <w:t>Storyboard</w:t>
       </w:r>
       <w:bookmarkEnd w:id="3"/>
+    </w:p>
+    <w:p>
+      <w:bookmarkStart w:id="4" w:name="_Toc231032604"/>
+    </w:p>
+    <w:p>
+      <w:pPr>
+        <w:sectPr>
+          <w:pgSz w:w="11906" w:h="16838"/>
+          <w:pgMar w:top="1440" w:right="1440" w:bottom="1440" w:left="1440" w:header="708" w:footer="708" w:gutter="0"/>
+          <w:cols w:space="708"/>
+          <w:titlePg/>
+          <w:docGrid w:linePitch="360"/>
+        </w:sectPr>
+      </w:pPr>
+    </w:p>
+    <w:p>
+      <w:pPr>
+        <w:pStyle w:val="Heading1"/>
+      </w:pPr>
+      <w:r>
+        <w:lastRenderedPageBreak/>
+        <w:t>Screen-Mockups</w:t>
+      </w:r>
+      <w:bookmarkEnd w:id="4"/>
     </w:p>
     <w:p>
       <w:pPr>
@@ -2099,7 +2177,7 @@
           <w:docGrid w:linePitch="360"/>
         </w:sectPr>
       </w:pPr>
-      <w:bookmarkStart w:id="4" w:name="_Toc231032604"/>
+      <w:bookmarkStart w:id="5" w:name="_Toc231032605"/>
     </w:p>
     <w:p>
       <w:pPr>
@@ -2107,9 +2185,9 @@
       </w:pPr>
       <w:r>
         <w:lastRenderedPageBreak/>
-        <w:t>Screen-Mockups</w:t>
+        <w:t>REST-Schnittstellen</w:t>
       </w:r>
-      <w:bookmarkEnd w:id="4"/>
+      <w:bookmarkEnd w:id="5"/>
     </w:p>
     <w:p>
       <w:pPr>
@@ -2122,7 +2200,7 @@
           <w:docGrid w:linePitch="360"/>
         </w:sectPr>
       </w:pPr>
-      <w:bookmarkStart w:id="5" w:name="_Toc231032605"/>
+      <w:bookmarkStart w:id="6" w:name="_Toc231032606"/>
     </w:p>
     <w:p>
       <w:pPr>
@@ -2130,9 +2208,9 @@
       </w:pPr>
       <w:r>
         <w:lastRenderedPageBreak/>
-        <w:t>REST-Schnittstellen</w:t>
+        <w:t>Testplan</w:t>
       </w:r>
-      <w:bookmarkEnd w:id="5"/>
+      <w:bookmarkEnd w:id="6"/>
     </w:p>
     <w:p>
       <w:pPr>
@@ -2145,7 +2223,7 @@
           <w:docGrid w:linePitch="360"/>
         </w:sectPr>
       </w:pPr>
-      <w:bookmarkStart w:id="6" w:name="_Toc231032606"/>
+      <w:bookmarkStart w:id="7" w:name="_Toc231032607"/>
     </w:p>
     <w:p>
       <w:pPr>
@@ -2153,9 +2231,9 @@
       </w:pPr>
       <w:r>
         <w:lastRenderedPageBreak/>
-        <w:t>Testplan</w:t>
+        <w:t>Testergebnisse</w:t>
       </w:r>
-      <w:bookmarkEnd w:id="6"/>
+      <w:bookmarkEnd w:id="7"/>
     </w:p>
     <w:p>
       <w:pPr>
@@ -2168,7 +2246,7 @@
           <w:docGrid w:linePitch="360"/>
         </w:sectPr>
       </w:pPr>
-      <w:bookmarkStart w:id="7" w:name="_Toc231032607"/>
+      <w:bookmarkStart w:id="8" w:name="_Toc231032608"/>
     </w:p>
     <w:p>
       <w:pPr>
@@ -2176,9 +2254,9 @@
       </w:pPr>
       <w:r>
         <w:lastRenderedPageBreak/>
-        <w:t>Testergebnisse</w:t>
+        <w:t>Installationsanleitung</w:t>
       </w:r>
-      <w:bookmarkEnd w:id="7"/>
+      <w:bookmarkEnd w:id="8"/>
     </w:p>
     <w:p>
       <w:pPr>
@@ -2191,29 +2269,6 @@
           <w:docGrid w:linePitch="360"/>
         </w:sectPr>
       </w:pPr>
-      <w:bookmarkStart w:id="8" w:name="_Toc231032608"/>
-    </w:p>
-    <w:p>
-      <w:pPr>
-        <w:pStyle w:val="Heading1"/>
-      </w:pPr>
-      <w:r>
-        <w:lastRenderedPageBreak/>
-        <w:t>Installationsanleitung</w:t>
-      </w:r>
-      <w:bookmarkEnd w:id="8"/>
-    </w:p>
-    <w:p>
-      <w:pPr>
-        <w:pStyle w:val="Heading1"/>
-        <w:sectPr>
-          <w:pgSz w:w="11906" w:h="16838"/>
-          <w:pgMar w:top="1440" w:right="1440" w:bottom="1440" w:left="1440" w:header="708" w:footer="708" w:gutter="0"/>
-          <w:cols w:space="708"/>
-          <w:titlePg/>
-          <w:docGrid w:linePitch="360"/>
-        </w:sectPr>
-      </w:pPr>
       <w:bookmarkStart w:id="9" w:name="_Toc231032609"/>
     </w:p>
     <w:p>
@@ -2227,7 +2282,7 @@
       <w:bookmarkEnd w:id="9"/>
     </w:p>
     <w:p>
-      <w:hyperlink r:id="rId14" w:history="1">
+      <w:hyperlink r:id="rId15" w:history="1">
         <w:r>
           <w:rPr>
             <w:rStyle w:val="Hyperlink"/>
@@ -2445,8 +2500,13 @@
     <w:pPr>
       <w:pStyle w:val="Header"/>
     </w:pPr>
+    <w:proofErr w:type="spellStart"/>
     <w:r>
-      <w:t>WordBank-Projektdokumentation</w:t>
+      <w:t>WordBank</w:t>
+    </w:r>
+    <w:proofErr w:type="spellEnd"/>
+    <w:r>
+      <w:t>-Projektdokumentation</w:t>
     </w:r>
     <w:r>
       <w:tab/>
@@ -2777,6 +2837,119 @@
     </w:lvl>
   </w:abstractNum>
   <w:abstractNum w:abstractNumId="3" w15:restartNumberingAfterBreak="0">
+    <w:nsid w:val="398E42B4"/>
+    <w:multiLevelType w:val="hybridMultilevel"/>
+    <w:tmpl w:val="60E0CCAC"/>
+    <w:lvl w:ilvl="0" w:tplc="08070001">
+      <w:start w:val="1"/>
+      <w:numFmt w:val="bullet"/>
+      <w:lvlText w:val=""/>
+      <w:lvlJc w:val="left"/>
+      <w:pPr>
+        <w:ind w:left="720" w:hanging="360"/>
+      </w:pPr>
+      <w:rPr>
+        <w:rFonts w:ascii="Symbol" w:hAnsi="Symbol" w:hint="default"/>
+      </w:rPr>
+    </w:lvl>
+    <w:lvl w:ilvl="1" w:tplc="08070003" w:tentative="1">
+      <w:start w:val="1"/>
+      <w:numFmt w:val="bullet"/>
+      <w:lvlText w:val="o"/>
+      <w:lvlJc w:val="left"/>
+      <w:pPr>
+        <w:ind w:left="1440" w:hanging="360"/>
+      </w:pPr>
+      <w:rPr>
+        <w:rFonts w:ascii="Courier New" w:hAnsi="Courier New" w:cs="Courier New" w:hint="default"/>
+      </w:rPr>
+    </w:lvl>
+    <w:lvl w:ilvl="2" w:tplc="08070005" w:tentative="1">
+      <w:start w:val="1"/>
+      <w:numFmt w:val="bullet"/>
+      <w:lvlText w:val=""/>
+      <w:lvlJc w:val="left"/>
+      <w:pPr>
+        <w:ind w:left="2160" w:hanging="360"/>
+      </w:pPr>
+      <w:rPr>
+        <w:rFonts w:ascii="Wingdings" w:hAnsi="Wingdings" w:hint="default"/>
+      </w:rPr>
+    </w:lvl>
+    <w:lvl w:ilvl="3" w:tplc="08070001" w:tentative="1">
+      <w:start w:val="1"/>
+      <w:numFmt w:val="bullet"/>
+      <w:lvlText w:val=""/>
+      <w:lvlJc w:val="left"/>
+      <w:pPr>
+        <w:ind w:left="2880" w:hanging="360"/>
+      </w:pPr>
+      <w:rPr>
+        <w:rFonts w:ascii="Symbol" w:hAnsi="Symbol" w:hint="default"/>
+      </w:rPr>
+    </w:lvl>
+    <w:lvl w:ilvl="4" w:tplc="08070003" w:tentative="1">
+      <w:start w:val="1"/>
+      <w:numFmt w:val="bullet"/>
+      <w:lvlText w:val="o"/>
+      <w:lvlJc w:val="left"/>
+      <w:pPr>
+        <w:ind w:left="3600" w:hanging="360"/>
+      </w:pPr>
+      <w:rPr>
+        <w:rFonts w:ascii="Courier New" w:hAnsi="Courier New" w:cs="Courier New" w:hint="default"/>
+      </w:rPr>
+    </w:lvl>
+    <w:lvl w:ilvl="5" w:tplc="08070005" w:tentative="1">
+      <w:start w:val="1"/>
+      <w:numFmt w:val="bullet"/>
+      <w:lvlText w:val=""/>
+      <w:lvlJc w:val="left"/>
+      <w:pPr>
+        <w:ind w:left="4320" w:hanging="360"/>
+      </w:pPr>
+      <w:rPr>
+        <w:rFonts w:ascii="Wingdings" w:hAnsi="Wingdings" w:hint="default"/>
+      </w:rPr>
+    </w:lvl>
+    <w:lvl w:ilvl="6" w:tplc="08070001" w:tentative="1">
+      <w:start w:val="1"/>
+      <w:numFmt w:val="bullet"/>
+      <w:lvlText w:val=""/>
+      <w:lvlJc w:val="left"/>
+      <w:pPr>
+        <w:ind w:left="5040" w:hanging="360"/>
+      </w:pPr>
+      <w:rPr>
+        <w:rFonts w:ascii="Symbol" w:hAnsi="Symbol" w:hint="default"/>
+      </w:rPr>
+    </w:lvl>
+    <w:lvl w:ilvl="7" w:tplc="08070003" w:tentative="1">
+      <w:start w:val="1"/>
+      <w:numFmt w:val="bullet"/>
+      <w:lvlText w:val="o"/>
+      <w:lvlJc w:val="left"/>
+      <w:pPr>
+        <w:ind w:left="5760" w:hanging="360"/>
+      </w:pPr>
+      <w:rPr>
+        <w:rFonts w:ascii="Courier New" w:hAnsi="Courier New" w:cs="Courier New" w:hint="default"/>
+      </w:rPr>
+    </w:lvl>
+    <w:lvl w:ilvl="8" w:tplc="08070005" w:tentative="1">
+      <w:start w:val="1"/>
+      <w:numFmt w:val="bullet"/>
+      <w:lvlText w:val=""/>
+      <w:lvlJc w:val="left"/>
+      <w:pPr>
+        <w:ind w:left="6480" w:hanging="360"/>
+      </w:pPr>
+      <w:rPr>
+        <w:rFonts w:ascii="Wingdings" w:hAnsi="Wingdings" w:hint="default"/>
+      </w:rPr>
+    </w:lvl>
+  </w:abstractNum>
+  <w:abstractNum w:abstractNumId="4" w15:restartNumberingAfterBreak="0">
     <w:nsid w:val="4B8E504B"/>
     <w:multiLevelType w:val="hybridMultilevel"/>
     <w:tmpl w:val="8E3AE292"/>
@@ -2865,7 +3038,179 @@
       </w:pPr>
     </w:lvl>
   </w:abstractNum>
-  <w:abstractNum w:abstractNumId="4" w15:restartNumberingAfterBreak="0">
+  <w:abstractNum w:abstractNumId="5" w15:restartNumberingAfterBreak="0">
+    <w:nsid w:val="663E26AC"/>
+    <w:multiLevelType w:val="hybridMultilevel"/>
+    <w:tmpl w:val="FF5E55F2"/>
+    <w:lvl w:ilvl="0" w:tplc="08070011">
+      <w:start w:val="1"/>
+      <w:numFmt w:val="decimal"/>
+      <w:lvlText w:val="%1)"/>
+      <w:lvlJc w:val="left"/>
+      <w:pPr>
+        <w:ind w:left="720" w:hanging="360"/>
+      </w:pPr>
+    </w:lvl>
+    <w:lvl w:ilvl="1" w:tplc="08070019" w:tentative="1">
+      <w:start w:val="1"/>
+      <w:numFmt w:val="lowerLetter"/>
+      <w:lvlText w:val="%2."/>
+      <w:lvlJc w:val="left"/>
+      <w:pPr>
+        <w:ind w:left="1440" w:hanging="360"/>
+      </w:pPr>
+    </w:lvl>
+    <w:lvl w:ilvl="2" w:tplc="0807001B" w:tentative="1">
+      <w:start w:val="1"/>
+      <w:numFmt w:val="lowerRoman"/>
+      <w:lvlText w:val="%3."/>
+      <w:lvlJc w:val="right"/>
+      <w:pPr>
+        <w:ind w:left="2160" w:hanging="180"/>
+      </w:pPr>
+    </w:lvl>
+    <w:lvl w:ilvl="3" w:tplc="0807000F" w:tentative="1">
+      <w:start w:val="1"/>
+      <w:numFmt w:val="decimal"/>
+      <w:lvlText w:val="%4."/>
+      <w:lvlJc w:val="left"/>
+      <w:pPr>
+        <w:ind w:left="2880" w:hanging="360"/>
+      </w:pPr>
+    </w:lvl>
+    <w:lvl w:ilvl="4" w:tplc="08070019" w:tentative="1">
+      <w:start w:val="1"/>
+      <w:numFmt w:val="lowerLetter"/>
+      <w:lvlText w:val="%5."/>
+      <w:lvlJc w:val="left"/>
+      <w:pPr>
+        <w:ind w:left="3600" w:hanging="360"/>
+      </w:pPr>
+    </w:lvl>
+    <w:lvl w:ilvl="5" w:tplc="0807001B" w:tentative="1">
+      <w:start w:val="1"/>
+      <w:numFmt w:val="lowerRoman"/>
+      <w:lvlText w:val="%6."/>
+      <w:lvlJc w:val="right"/>
+      <w:pPr>
+        <w:ind w:left="4320" w:hanging="180"/>
+      </w:pPr>
+    </w:lvl>
+    <w:lvl w:ilvl="6" w:tplc="0807000F" w:tentative="1">
+      <w:start w:val="1"/>
+      <w:numFmt w:val="decimal"/>
+      <w:lvlText w:val="%7."/>
+      <w:lvlJc w:val="left"/>
+      <w:pPr>
+        <w:ind w:left="5040" w:hanging="360"/>
+      </w:pPr>
+    </w:lvl>
+    <w:lvl w:ilvl="7" w:tplc="08070019" w:tentative="1">
+      <w:start w:val="1"/>
+      <w:numFmt w:val="lowerLetter"/>
+      <w:lvlText w:val="%8."/>
+      <w:lvlJc w:val="left"/>
+      <w:pPr>
+        <w:ind w:left="5760" w:hanging="360"/>
+      </w:pPr>
+    </w:lvl>
+    <w:lvl w:ilvl="8" w:tplc="0807001B" w:tentative="1">
+      <w:start w:val="1"/>
+      <w:numFmt w:val="lowerRoman"/>
+      <w:lvlText w:val="%9."/>
+      <w:lvlJc w:val="right"/>
+      <w:pPr>
+        <w:ind w:left="6480" w:hanging="180"/>
+      </w:pPr>
+    </w:lvl>
+  </w:abstractNum>
+  <w:abstractNum w:abstractNumId="6" w15:restartNumberingAfterBreak="0">
+    <w:nsid w:val="664F2875"/>
+    <w:multiLevelType w:val="hybridMultilevel"/>
+    <w:tmpl w:val="8DE2A612"/>
+    <w:lvl w:ilvl="0" w:tplc="08070011">
+      <w:start w:val="1"/>
+      <w:numFmt w:val="decimal"/>
+      <w:lvlText w:val="%1)"/>
+      <w:lvlJc w:val="left"/>
+      <w:pPr>
+        <w:ind w:left="720" w:hanging="360"/>
+      </w:pPr>
+    </w:lvl>
+    <w:lvl w:ilvl="1" w:tplc="08070019" w:tentative="1">
+      <w:start w:val="1"/>
+      <w:numFmt w:val="lowerLetter"/>
+      <w:lvlText w:val="%2."/>
+      <w:lvlJc w:val="left"/>
+      <w:pPr>
+        <w:ind w:left="1440" w:hanging="360"/>
+      </w:pPr>
+    </w:lvl>
+    <w:lvl w:ilvl="2" w:tplc="0807001B" w:tentative="1">
+      <w:start w:val="1"/>
+      <w:numFmt w:val="lowerRoman"/>
+      <w:lvlText w:val="%3."/>
+      <w:lvlJc w:val="right"/>
+      <w:pPr>
+        <w:ind w:left="2160" w:hanging="180"/>
+      </w:pPr>
+    </w:lvl>
+    <w:lvl w:ilvl="3" w:tplc="0807000F" w:tentative="1">
+      <w:start w:val="1"/>
+      <w:numFmt w:val="decimal"/>
+      <w:lvlText w:val="%4."/>
+      <w:lvlJc w:val="left"/>
+      <w:pPr>
+        <w:ind w:left="2880" w:hanging="360"/>
+      </w:pPr>
+    </w:lvl>
+    <w:lvl w:ilvl="4" w:tplc="08070019" w:tentative="1">
+      <w:start w:val="1"/>
+      <w:numFmt w:val="lowerLetter"/>
+      <w:lvlText w:val="%5."/>
+      <w:lvlJc w:val="left"/>
+      <w:pPr>
+        <w:ind w:left="3600" w:hanging="360"/>
+      </w:pPr>
+    </w:lvl>
+    <w:lvl w:ilvl="5" w:tplc="0807001B" w:tentative="1">
+      <w:start w:val="1"/>
+      <w:numFmt w:val="lowerRoman"/>
+      <w:lvlText w:val="%6."/>
+      <w:lvlJc w:val="right"/>
+      <w:pPr>
+        <w:ind w:left="4320" w:hanging="180"/>
+      </w:pPr>
+    </w:lvl>
+    <w:lvl w:ilvl="6" w:tplc="0807000F" w:tentative="1">
+      <w:start w:val="1"/>
+      <w:numFmt w:val="decimal"/>
+      <w:lvlText w:val="%7."/>
+      <w:lvlJc w:val="left"/>
+      <w:pPr>
+        <w:ind w:left="5040" w:hanging="360"/>
+      </w:pPr>
+    </w:lvl>
+    <w:lvl w:ilvl="7" w:tplc="08070019" w:tentative="1">
+      <w:start w:val="1"/>
+      <w:numFmt w:val="lowerLetter"/>
+      <w:lvlText w:val="%8."/>
+      <w:lvlJc w:val="left"/>
+      <w:pPr>
+        <w:ind w:left="5760" w:hanging="360"/>
+      </w:pPr>
+    </w:lvl>
+    <w:lvl w:ilvl="8" w:tplc="0807001B" w:tentative="1">
+      <w:start w:val="1"/>
+      <w:numFmt w:val="lowerRoman"/>
+      <w:lvlText w:val="%9."/>
+      <w:lvlJc w:val="right"/>
+      <w:pPr>
+        <w:ind w:left="6480" w:hanging="180"/>
+      </w:pPr>
+    </w:lvl>
+  </w:abstractNum>
+  <w:abstractNum w:abstractNumId="7" w15:restartNumberingAfterBreak="0">
     <w:nsid w:val="675B5C9E"/>
     <w:multiLevelType w:val="hybridMultilevel"/>
     <w:tmpl w:val="7F147F0A"/>
@@ -2978,7 +3323,7 @@
       </w:rPr>
     </w:lvl>
   </w:abstractNum>
-  <w:abstractNum w:abstractNumId="5" w15:restartNumberingAfterBreak="0">
+  <w:abstractNum w:abstractNumId="8" w15:restartNumberingAfterBreak="0">
     <w:nsid w:val="718F551F"/>
     <w:multiLevelType w:val="hybridMultilevel"/>
     <w:tmpl w:val="7ED67944"/>
@@ -3091,8 +3436,94 @@
       </w:rPr>
     </w:lvl>
   </w:abstractNum>
+  <w:abstractNum w:abstractNumId="9" w15:restartNumberingAfterBreak="0">
+    <w:nsid w:val="77B524F7"/>
+    <w:multiLevelType w:val="hybridMultilevel"/>
+    <w:tmpl w:val="C68441AA"/>
+    <w:lvl w:ilvl="0" w:tplc="08070011">
+      <w:start w:val="1"/>
+      <w:numFmt w:val="decimal"/>
+      <w:lvlText w:val="%1)"/>
+      <w:lvlJc w:val="left"/>
+      <w:pPr>
+        <w:ind w:left="720" w:hanging="360"/>
+      </w:pPr>
+    </w:lvl>
+    <w:lvl w:ilvl="1" w:tplc="08070019" w:tentative="1">
+      <w:start w:val="1"/>
+      <w:numFmt w:val="lowerLetter"/>
+      <w:lvlText w:val="%2."/>
+      <w:lvlJc w:val="left"/>
+      <w:pPr>
+        <w:ind w:left="1440" w:hanging="360"/>
+      </w:pPr>
+    </w:lvl>
+    <w:lvl w:ilvl="2" w:tplc="0807001B" w:tentative="1">
+      <w:start w:val="1"/>
+      <w:numFmt w:val="lowerRoman"/>
+      <w:lvlText w:val="%3."/>
+      <w:lvlJc w:val="right"/>
+      <w:pPr>
+        <w:ind w:left="2160" w:hanging="180"/>
+      </w:pPr>
+    </w:lvl>
+    <w:lvl w:ilvl="3" w:tplc="0807000F" w:tentative="1">
+      <w:start w:val="1"/>
+      <w:numFmt w:val="decimal"/>
+      <w:lvlText w:val="%4."/>
+      <w:lvlJc w:val="left"/>
+      <w:pPr>
+        <w:ind w:left="2880" w:hanging="360"/>
+      </w:pPr>
+    </w:lvl>
+    <w:lvl w:ilvl="4" w:tplc="08070019" w:tentative="1">
+      <w:start w:val="1"/>
+      <w:numFmt w:val="lowerLetter"/>
+      <w:lvlText w:val="%5."/>
+      <w:lvlJc w:val="left"/>
+      <w:pPr>
+        <w:ind w:left="3600" w:hanging="360"/>
+      </w:pPr>
+    </w:lvl>
+    <w:lvl w:ilvl="5" w:tplc="0807001B" w:tentative="1">
+      <w:start w:val="1"/>
+      <w:numFmt w:val="lowerRoman"/>
+      <w:lvlText w:val="%6."/>
+      <w:lvlJc w:val="right"/>
+      <w:pPr>
+        <w:ind w:left="4320" w:hanging="180"/>
+      </w:pPr>
+    </w:lvl>
+    <w:lvl w:ilvl="6" w:tplc="0807000F" w:tentative="1">
+      <w:start w:val="1"/>
+      <w:numFmt w:val="decimal"/>
+      <w:lvlText w:val="%7."/>
+      <w:lvlJc w:val="left"/>
+      <w:pPr>
+        <w:ind w:left="5040" w:hanging="360"/>
+      </w:pPr>
+    </w:lvl>
+    <w:lvl w:ilvl="7" w:tplc="08070019" w:tentative="1">
+      <w:start w:val="1"/>
+      <w:numFmt w:val="lowerLetter"/>
+      <w:lvlText w:val="%8."/>
+      <w:lvlJc w:val="left"/>
+      <w:pPr>
+        <w:ind w:left="5760" w:hanging="360"/>
+      </w:pPr>
+    </w:lvl>
+    <w:lvl w:ilvl="8" w:tplc="0807001B" w:tentative="1">
+      <w:start w:val="1"/>
+      <w:numFmt w:val="lowerRoman"/>
+      <w:lvlText w:val="%9."/>
+      <w:lvlJc w:val="right"/>
+      <w:pPr>
+        <w:ind w:left="6480" w:hanging="180"/>
+      </w:pPr>
+    </w:lvl>
+  </w:abstractNum>
   <w:num w:numId="1" w16cid:durableId="581918073">
-    <w:abstractNumId w:val="3"/>
+    <w:abstractNumId w:val="4"/>
   </w:num>
   <w:num w:numId="2" w16cid:durableId="1793016869">
     <w:abstractNumId w:val="0"/>
@@ -3101,13 +3532,25 @@
     <w:abstractNumId w:val="1"/>
   </w:num>
   <w:num w:numId="4" w16cid:durableId="629676799">
-    <w:abstractNumId w:val="5"/>
+    <w:abstractNumId w:val="8"/>
   </w:num>
   <w:num w:numId="5" w16cid:durableId="1251814425">
-    <w:abstractNumId w:val="4"/>
+    <w:abstractNumId w:val="7"/>
   </w:num>
   <w:num w:numId="6" w16cid:durableId="366683109">
     <w:abstractNumId w:val="2"/>
+  </w:num>
+  <w:num w:numId="7" w16cid:durableId="196433484">
+    <w:abstractNumId w:val="5"/>
+  </w:num>
+  <w:num w:numId="8" w16cid:durableId="700010427">
+    <w:abstractNumId w:val="9"/>
+  </w:num>
+  <w:num w:numId="9" w16cid:durableId="704870452">
+    <w:abstractNumId w:val="3"/>
+  </w:num>
+  <w:num w:numId="10" w16cid:durableId="531579270">
+    <w:abstractNumId w:val="6"/>
   </w:num>
 </w:numbering>
 </file>
@@ -3715,7 +4158,6 @@
   <w:style w:type="character" w:default="1" w:styleId="DefaultParagraphFont">
     <w:name w:val="Default Paragraph Font"/>
     <w:uiPriority w:val="1"/>
-    <w:semiHidden/>
     <w:unhideWhenUsed/>
   </w:style>
   <w:style w:type="table" w:default="1" w:styleId="TableNormal">

</xml_diff>